<commit_message>
Strengthen short-term model defense diagnostics
</commit_message>
<xml_diff>
--- a/output/final/短期动态模型论文.docx
+++ b/output/final/短期动态模型论文.docx
@@ -5505,7 +5505,7 @@
     </w:tbl>
     <w:bookmarkEnd w:id="25"/>
     <w:bookmarkEnd w:id="26"/>
-    <w:bookmarkStart w:id="50" w:name="结果分析"/>
+    <w:bookmarkStart w:id="60" w:name="结果分析"/>
     <w:p>
       <w:pPr>
         <w:pStyle w:val="Heading1"/>
@@ -6488,7 +6488,7 @@
       </w:r>
     </w:p>
     <w:bookmarkEnd w:id="42"/>
-    <w:bookmarkStart w:id="49" w:name="质量检验与稳健性分析"/>
+    <w:bookmarkStart w:id="43" w:name="质量检验与稳健性分析"/>
     <w:p>
       <w:pPr>
         <w:pStyle w:val="Heading2"/>
@@ -7013,6 +7013,522 @@
         <w:t xml:space="preserve">0.776，说明模型中的供需、风险和缓冲机制提供了价格惯性之外的解释力。</w:t>
       </w:r>
     </w:p>
+    <w:bookmarkEnd w:id="43"/>
+    <w:bookmarkStart w:id="59" w:name="基于基准对比与拐点分析的防御性检验"/>
+    <w:p>
+      <w:pPr>
+        <w:pStyle w:val="Heading2"/>
+      </w:pPr>
+      <w:r>
+        <w:rPr>
+          <w:rFonts w:hint="eastAsia"/>
+        </w:rPr>
+        <w:t xml:space="preserve">基于基准对比与拐点分析的防御性检验</w:t>
+      </w:r>
+    </w:p>
+    <w:p>
+      <w:pPr>
+        <w:pStyle w:val="FirstParagraph"/>
+      </w:pPr>
+      <w:r>
+        <w:rPr>
+          <w:rFonts w:hint="eastAsia"/>
+        </w:rPr>
+        <w:t xml:space="preserve">由于原油价格具有明显时间序列惯性，若不与朴素模型比较，单独报告</w:t>
+      </w:r>
+      <w:r>
+        <w:t xml:space="preserve"> RMSE </w:t>
+      </w:r>
+      <w:r>
+        <w:rPr>
+          <w:rFonts w:hint="eastAsia"/>
+        </w:rPr>
+        <w:t xml:space="preserve">容易高估模型价值。本文进一步引入朴素上一日基准、三日均值基准、漂移随机游走基准和滚动</w:t>
+      </w:r>
+      <w:r>
+        <w:t xml:space="preserve"> ARIMA(1,1,0) </w:t>
+      </w:r>
+      <w:r>
+        <w:rPr>
+          <w:rFonts w:hint="eastAsia"/>
+        </w:rPr>
+        <w:t xml:space="preserve">基准。所有基准模型在第</w:t>
+      </w:r>
+      <w:r>
+        <w:t xml:space="preserve"> </w:t>
+      </w:r>
+      <m:oMath>
+        <m:r>
+          <m:t>t</m:t>
+        </m:r>
+      </m:oMath>
+      <w:r>
+        <w:t xml:space="preserve"> </w:t>
+      </w:r>
+      <w:r>
+        <w:rPr>
+          <w:rFonts w:hint="eastAsia"/>
+        </w:rPr>
+        <w:t xml:space="preserve">日预测时只使用第</w:t>
+      </w:r>
+      <w:r>
+        <w:t xml:space="preserve"> </w:t>
+      </w:r>
+      <m:oMath>
+        <m:r>
+          <m:t>t</m:t>
+        </m:r>
+        <m:r>
+          <m:rPr>
+            <m:sty m:val="p"/>
+          </m:rPr>
+          <m:t>−</m:t>
+        </m:r>
+        <m:r>
+          <m:t>1</m:t>
+        </m:r>
+      </m:oMath>
+      <w:r>
+        <w:t xml:space="preserve"> </w:t>
+      </w:r>
+      <w:r>
+        <w:rPr>
+          <w:rFonts w:hint="eastAsia"/>
+        </w:rPr>
+        <w:t xml:space="preserve">日及以前的信息。</w:t>
+      </w:r>
+    </w:p>
+    <w:p>
+      <w:pPr>
+        <w:pStyle w:val="TableCaption"/>
+      </w:pPr>
+      <w:r>
+        <w:rPr>
+          <w:rFonts w:hint="eastAsia"/>
+        </w:rPr>
+        <w:t xml:space="preserve">短期模型与朴素/时间序列基准对比</w:t>
+      </w:r>
+    </w:p>
+    <w:tbl>
+      <w:tblPr>
+        <w:tblStyle w:val="Table"/>
+        <w:tblW w:type="auto" w:w="0"/>
+        <w:tblLook w:firstRow="1" w:lastRow="0" w:firstColumn="0" w:lastColumn="0" w:noHBand="0" w:noVBand="0" w:val="0020"/>
+        <w:tblCaption w:val="短期模型与朴素/时间序列基准对比"/>
+      </w:tblPr>
+      <w:tblGrid>
+        <w:gridCol w:w="1584"/>
+        <w:gridCol w:w="1584"/>
+        <w:gridCol w:w="1584"/>
+        <w:gridCol w:w="1584"/>
+        <w:gridCol w:w="1584"/>
+      </w:tblGrid>
+      <w:tr>
+        <w:trPr>
+          <w:tblHeader w:val="on"/>
+        </w:trPr>
+        <w:tc>
+          <w:tcPr/>
+          <w:p>
+            <w:pPr>
+              <w:pStyle w:val="Compact"/>
+              <w:jc w:val="left"/>
+            </w:pPr>
+            <w:r>
+              <w:rPr>
+                <w:rFonts w:hint="eastAsia"/>
+              </w:rPr>
+              <w:t xml:space="preserve">模型</w:t>
+            </w:r>
+          </w:p>
+        </w:tc>
+        <w:tc>
+          <w:tcPr/>
+          <w:p>
+            <w:pPr>
+              <w:pStyle w:val="Compact"/>
+              <w:jc w:val="right"/>
+            </w:pPr>
+            <w:r>
+              <w:t xml:space="preserve">RMSE</w:t>
+            </w:r>
+          </w:p>
+        </w:tc>
+        <w:tc>
+          <w:tcPr/>
+          <w:p>
+            <w:pPr>
+              <w:pStyle w:val="Compact"/>
+              <w:jc w:val="right"/>
+            </w:pPr>
+            <w:r>
+              <w:t xml:space="preserve">MAE</w:t>
+            </w:r>
+          </w:p>
+        </w:tc>
+        <w:tc>
+          <w:tcPr/>
+          <w:p>
+            <w:pPr>
+              <w:pStyle w:val="Compact"/>
+              <w:jc w:val="right"/>
+            </w:pPr>
+            <w:r>
+              <w:t xml:space="preserve">MAPE</w:t>
+            </w:r>
+          </w:p>
+        </w:tc>
+        <w:tc>
+          <w:tcPr/>
+          <w:p>
+            <w:pPr>
+              <w:pStyle w:val="Compact"/>
+              <w:jc w:val="right"/>
+            </w:pPr>
+            <w:r>
+              <w:rPr>
+                <w:rFonts w:hint="eastAsia"/>
+              </w:rPr>
+              <w:t xml:space="preserve">方向命中率</w:t>
+            </w:r>
+          </w:p>
+        </w:tc>
+      </w:tr>
+      <w:tr>
+        <w:tc>
+          <w:tcPr/>
+          <w:p>
+            <w:pPr>
+              <w:pStyle w:val="Compact"/>
+              <w:jc w:val="left"/>
+            </w:pPr>
+            <w:r>
+              <w:rPr>
+                <w:rFonts w:hint="eastAsia"/>
+              </w:rPr>
+              <w:t xml:space="preserve">本文短期动态模型</w:t>
+            </w:r>
+          </w:p>
+        </w:tc>
+        <w:tc>
+          <w:tcPr/>
+          <w:p>
+            <w:pPr>
+              <w:pStyle w:val="Compact"/>
+              <w:jc w:val="right"/>
+            </w:pPr>
+            <w:r>
+              <w:t xml:space="preserve">3.47</w:t>
+            </w:r>
+          </w:p>
+        </w:tc>
+        <w:tc>
+          <w:tcPr/>
+          <w:p>
+            <w:pPr>
+              <w:pStyle w:val="Compact"/>
+              <w:jc w:val="right"/>
+            </w:pPr>
+            <w:r>
+              <w:t xml:space="preserve">2.89</w:t>
+            </w:r>
+          </w:p>
+        </w:tc>
+        <w:tc>
+          <w:tcPr/>
+          <w:p>
+            <w:pPr>
+              <w:pStyle w:val="Compact"/>
+              <w:jc w:val="right"/>
+            </w:pPr>
+            <w:r>
+              <w:t xml:space="preserve">2.90%</w:t>
+            </w:r>
+          </w:p>
+        </w:tc>
+        <w:tc>
+          <w:tcPr/>
+          <w:p>
+            <w:pPr>
+              <w:pStyle w:val="Compact"/>
+              <w:jc w:val="right"/>
+            </w:pPr>
+            <w:r>
+              <w:t xml:space="preserve">64.4%</w:t>
+            </w:r>
+          </w:p>
+        </w:tc>
+      </w:tr>
+      <w:tr>
+        <w:tc>
+          <w:tcPr/>
+          <w:p>
+            <w:pPr>
+              <w:pStyle w:val="Compact"/>
+              <w:jc w:val="left"/>
+            </w:pPr>
+            <w:r>
+              <w:rPr>
+                <w:rFonts w:hint="eastAsia"/>
+              </w:rPr>
+              <w:t xml:space="preserve">朴素上一日基准</w:t>
+            </w:r>
+          </w:p>
+        </w:tc>
+        <w:tc>
+          <w:tcPr/>
+          <w:p>
+            <w:pPr>
+              <w:pStyle w:val="Compact"/>
+              <w:jc w:val="right"/>
+            </w:pPr>
+            <w:r>
+              <w:t xml:space="preserve">4.47</w:t>
+            </w:r>
+          </w:p>
+        </w:tc>
+        <w:tc>
+          <w:tcPr/>
+          <w:p>
+            <w:pPr>
+              <w:pStyle w:val="Compact"/>
+              <w:jc w:val="right"/>
+            </w:pPr>
+            <w:r>
+              <w:t xml:space="preserve">3.57</w:t>
+            </w:r>
+          </w:p>
+        </w:tc>
+        <w:tc>
+          <w:tcPr/>
+          <w:p>
+            <w:pPr>
+              <w:pStyle w:val="Compact"/>
+              <w:jc w:val="right"/>
+            </w:pPr>
+            <w:r>
+              <w:t xml:space="preserve">3.54%</w:t>
+            </w:r>
+          </w:p>
+        </w:tc>
+        <w:tc>
+          <w:tcPr/>
+          <w:p>
+            <w:pPr>
+              <w:pStyle w:val="Compact"/>
+              <w:jc w:val="right"/>
+            </w:pPr>
+            <w:r>
+              <w:t xml:space="preserve">46.7%</w:t>
+            </w:r>
+          </w:p>
+        </w:tc>
+      </w:tr>
+      <w:tr>
+        <w:tc>
+          <w:tcPr/>
+          <w:p>
+            <w:pPr>
+              <w:pStyle w:val="Compact"/>
+              <w:jc w:val="left"/>
+            </w:pPr>
+            <w:r>
+              <w:rPr>
+                <w:rFonts w:hint="eastAsia"/>
+              </w:rPr>
+              <w:t xml:space="preserve">三日均值基准</w:t>
+            </w:r>
+          </w:p>
+        </w:tc>
+        <w:tc>
+          <w:tcPr/>
+          <w:p>
+            <w:pPr>
+              <w:pStyle w:val="Compact"/>
+              <w:jc w:val="right"/>
+            </w:pPr>
+            <w:r>
+              <w:t xml:space="preserve">5.18</w:t>
+            </w:r>
+          </w:p>
+        </w:tc>
+        <w:tc>
+          <w:tcPr/>
+          <w:p>
+            <w:pPr>
+              <w:pStyle w:val="Compact"/>
+              <w:jc w:val="right"/>
+            </w:pPr>
+            <w:r>
+              <w:t xml:space="preserve">4.16</w:t>
+            </w:r>
+          </w:p>
+        </w:tc>
+        <w:tc>
+          <w:tcPr/>
+          <w:p>
+            <w:pPr>
+              <w:pStyle w:val="Compact"/>
+              <w:jc w:val="right"/>
+            </w:pPr>
+            <w:r>
+              <w:t xml:space="preserve">4.15%</w:t>
+            </w:r>
+          </w:p>
+        </w:tc>
+        <w:tc>
+          <w:tcPr/>
+          <w:p>
+            <w:pPr>
+              <w:pStyle w:val="Compact"/>
+              <w:jc w:val="right"/>
+            </w:pPr>
+            <w:r>
+              <w:t xml:space="preserve">44.4%</w:t>
+            </w:r>
+          </w:p>
+        </w:tc>
+      </w:tr>
+      <w:tr>
+        <w:tc>
+          <w:tcPr/>
+          <w:p>
+            <w:pPr>
+              <w:pStyle w:val="Compact"/>
+              <w:jc w:val="left"/>
+            </w:pPr>
+            <w:r>
+              <w:rPr>
+                <w:rFonts w:hint="eastAsia"/>
+              </w:rPr>
+              <w:t xml:space="preserve">漂移随机游走基准</w:t>
+            </w:r>
+          </w:p>
+        </w:tc>
+        <w:tc>
+          <w:tcPr/>
+          <w:p>
+            <w:pPr>
+              <w:pStyle w:val="Compact"/>
+              <w:jc w:val="right"/>
+            </w:pPr>
+            <w:r>
+              <w:t xml:space="preserve">4.84</w:t>
+            </w:r>
+          </w:p>
+        </w:tc>
+        <w:tc>
+          <w:tcPr/>
+          <w:p>
+            <w:pPr>
+              <w:pStyle w:val="Compact"/>
+              <w:jc w:val="right"/>
+            </w:pPr>
+            <w:r>
+              <w:t xml:space="preserve">3.94</w:t>
+            </w:r>
+          </w:p>
+        </w:tc>
+        <w:tc>
+          <w:tcPr/>
+          <w:p>
+            <w:pPr>
+              <w:pStyle w:val="Compact"/>
+              <w:jc w:val="right"/>
+            </w:pPr>
+            <w:r>
+              <w:t xml:space="preserve">3.91%</w:t>
+            </w:r>
+          </w:p>
+        </w:tc>
+        <w:tc>
+          <w:tcPr/>
+          <w:p>
+            <w:pPr>
+              <w:pStyle w:val="Compact"/>
+              <w:jc w:val="right"/>
+            </w:pPr>
+            <w:r>
+              <w:t xml:space="preserve">46.7%</w:t>
+            </w:r>
+          </w:p>
+        </w:tc>
+      </w:tr>
+      <w:tr>
+        <w:tc>
+          <w:tcPr/>
+          <w:p>
+            <w:pPr>
+              <w:pStyle w:val="Compact"/>
+              <w:jc w:val="left"/>
+            </w:pPr>
+            <w:r>
+              <w:rPr>
+                <w:rFonts w:hint="eastAsia"/>
+              </w:rPr>
+              <w:t xml:space="preserve">滚动</w:t>
+            </w:r>
+            <w:r>
+              <w:t xml:space="preserve"> ARIMA(1,1,0) </w:t>
+            </w:r>
+            <w:r>
+              <w:rPr>
+                <w:rFonts w:hint="eastAsia"/>
+              </w:rPr>
+              <w:t xml:space="preserve">基准</w:t>
+            </w:r>
+          </w:p>
+        </w:tc>
+        <w:tc>
+          <w:tcPr/>
+          <w:p>
+            <w:pPr>
+              <w:pStyle w:val="Compact"/>
+              <w:jc w:val="right"/>
+            </w:pPr>
+            <w:r>
+              <w:t xml:space="preserve">4.53</w:t>
+            </w:r>
+          </w:p>
+        </w:tc>
+        <w:tc>
+          <w:tcPr/>
+          <w:p>
+            <w:pPr>
+              <w:pStyle w:val="Compact"/>
+              <w:jc w:val="right"/>
+            </w:pPr>
+            <w:r>
+              <w:t xml:space="preserve">3.67</w:t>
+            </w:r>
+          </w:p>
+        </w:tc>
+        <w:tc>
+          <w:tcPr/>
+          <w:p>
+            <w:pPr>
+              <w:pStyle w:val="Compact"/>
+              <w:jc w:val="right"/>
+            </w:pPr>
+            <w:r>
+              <w:t xml:space="preserve">3.63%</w:t>
+            </w:r>
+          </w:p>
+        </w:tc>
+        <w:tc>
+          <w:tcPr/>
+          <w:p>
+            <w:pPr>
+              <w:pStyle w:val="Compact"/>
+              <w:jc w:val="right"/>
+            </w:pPr>
+            <w:r>
+              <w:t xml:space="preserve">46.7%</w:t>
+            </w:r>
+          </w:p>
+        </w:tc>
+      </w:tr>
+    </w:tbl>
     <w:p>
       <w:pPr>
         <w:pStyle w:val="CaptionedFigure"/>
@@ -7020,20 +7536,495 @@
       <w:r>
         <w:drawing>
           <wp:inline>
-            <wp:extent cx="5067300" cy="3774882"/>
+            <wp:extent cx="4800600" cy="2651760"/>
             <wp:effectExtent b="0" l="0" r="0" t="0"/>
-            <wp:docPr descr="" title="" id="44" name="Picture"/>
+            <wp:docPr descr="" title="" id="45" name="Picture"/>
             <a:graphic>
               <a:graphicData uri="http://schemas.openxmlformats.org/drawingml/2006/picture">
                 <pic:pic>
                   <pic:nvPicPr>
-                    <pic:cNvPr descr="短期模型残差诊断增强.png" id="45" name="Picture"/>
+                    <pic:cNvPr descr="短期模型基准对比.png" id="46" name="Picture"/>
                     <pic:cNvPicPr>
                       <a:picLocks noChangeArrowheads="1" noChangeAspect="1"/>
                     </pic:cNvPicPr>
                   </pic:nvPicPr>
                   <pic:blipFill>
-                    <a:blip r:embed="rId43"/>
+                    <a:blip r:embed="rId44"/>
+                    <a:stretch>
+                      <a:fillRect/>
+                    </a:stretch>
+                  </pic:blipFill>
+                  <pic:spPr bwMode="auto">
+                    <a:xfrm>
+                      <a:off x="0" y="0"/>
+                      <a:ext cx="4800600" cy="2651760"/>
+                    </a:xfrm>
+                    <a:prstGeom prst="rect">
+                      <a:avLst/>
+                    </a:prstGeom>
+                    <a:noFill/>
+                    <a:ln w="9525">
+                      <a:noFill/>
+                      <a:headEnd/>
+                      <a:tailEnd/>
+                    </a:ln>
+                  </pic:spPr>
+                </pic:pic>
+              </a:graphicData>
+            </a:graphic>
+          </wp:inline>
+        </w:drawing>
+      </w:r>
+    </w:p>
+    <w:p>
+      <w:pPr>
+        <w:pStyle w:val="ImageCaption"/>
+      </w:pPr>
+      <w:r>
+        <w:rPr>
+          <w:rFonts w:hint="eastAsia"/>
+        </w:rPr>
+        <w:t xml:space="preserve">短期模型与朴素/时间序列基准的</w:t>
+      </w:r>
+      <w:r>
+        <w:t xml:space="preserve"> RMSE </w:t>
+      </w:r>
+      <w:r>
+        <w:rPr>
+          <w:rFonts w:hint="eastAsia"/>
+        </w:rPr>
+        <w:t xml:space="preserve">对比。本文模型相对于上一日朴素基准</w:t>
+      </w:r>
+      <w:r>
+        <w:t xml:space="preserve"> RMSE </w:t>
+      </w:r>
+      <w:r>
+        <w:rPr>
+          <w:rFonts w:hint="eastAsia"/>
+        </w:rPr>
+        <w:t xml:space="preserve">改善</w:t>
+      </w:r>
+      <w:r>
+        <w:t xml:space="preserve"> </w:t>
+      </w:r>
+      <w:r>
+        <w:rPr>
+          <w:rFonts w:hint="eastAsia"/>
+        </w:rPr>
+        <w:t xml:space="preserve">22.4%，说明模型并非只复制价格惯性。</w:t>
+      </w:r>
+    </w:p>
+    <w:p>
+      <w:pPr>
+        <w:pStyle w:val="BodyText"/>
+      </w:pPr>
+      <w:r>
+        <w:rPr>
+          <w:rFonts w:hint="eastAsia"/>
+        </w:rPr>
+        <w:t xml:space="preserve">需要说明的是，本文短期模型不是日度交易意义上的单步</w:t>
+      </w:r>
+      <w:r>
+        <w:t xml:space="preserve"> </w:t>
+      </w:r>
+      <m:oMath>
+        <m:r>
+          <m:t>T</m:t>
+        </m:r>
+        <m:r>
+          <m:rPr>
+            <m:sty m:val="p"/>
+          </m:rPr>
+          <m:t>+</m:t>
+        </m:r>
+        <m:r>
+          <m:t>1</m:t>
+        </m:r>
+      </m:oMath>
+      <w:r>
+        <w:t xml:space="preserve"> </w:t>
+      </w:r>
+      <w:r>
+        <w:rPr>
+          <w:rFonts w:hint="eastAsia"/>
+        </w:rPr>
+        <w:t xml:space="preserve">预测器，而是条件机制递推模型。模型给定冲突开始、题面参数和校准参数后，从初始价格开始逐日递推，真实价格只用于校准和事后评价，不在每日递推中作为当日输入。因此，RMSE</w:t>
+      </w:r>
+      <w:r>
+        <w:t xml:space="preserve"> </w:t>
+      </w:r>
+      <w:r>
+        <w:rPr>
+          <w:rFonts w:hint="eastAsia"/>
+        </w:rPr>
+        <w:t xml:space="preserve">为</w:t>
+      </w:r>
+      <w:r>
+        <w:t xml:space="preserve"> 3.47 </w:t>
+      </w:r>
+      <w:r>
+        <w:rPr>
+          <w:rFonts w:hint="eastAsia"/>
+        </w:rPr>
+        <w:t xml:space="preserve">的含义是模型对冲突窗口整段价格路径的条件解释误差，而不是普通市场环境下的单日高频预测误差。</w:t>
+      </w:r>
+    </w:p>
+    <w:p>
+      <w:pPr>
+        <w:pStyle w:val="BodyText"/>
+      </w:pPr>
+      <w:r>
+        <w:rPr>
+          <w:rFonts w:hint="eastAsia"/>
+        </w:rPr>
+        <w:t xml:space="preserve">为了排除</w:t>
+      </w:r>
+      <w:r>
+        <w:rPr>
+          <w:rFonts w:hint="eastAsia"/>
+        </w:rPr>
+        <w:t xml:space="preserve">“预测曲线只是滞后复制真实价格”</w:t>
+      </w:r>
+      <w:r>
+        <w:rPr>
+          <w:rFonts w:hint="eastAsia"/>
+        </w:rPr>
+        <w:t xml:space="preserve">的质疑，本文将模型曲线整体向左、向右平移</w:t>
+      </w:r>
+      <w:r>
+        <w:t xml:space="preserve"> 1–5 </w:t>
+      </w:r>
+      <w:r>
+        <w:rPr>
+          <w:rFonts w:hint="eastAsia"/>
+        </w:rPr>
+        <w:t xml:space="preserve">天后重新计算</w:t>
+      </w:r>
+      <w:r>
+        <w:t xml:space="preserve"> </w:t>
+      </w:r>
+      <w:r>
+        <w:rPr>
+          <w:rFonts w:hint="eastAsia"/>
+        </w:rPr>
+        <w:t xml:space="preserve">RMSE。若模型严重滞后，则向左平移后</w:t>
+      </w:r>
+      <w:r>
+        <w:t xml:space="preserve"> RMSE </w:t>
+      </w:r>
+      <w:r>
+        <w:rPr>
+          <w:rFonts w:hint="eastAsia"/>
+        </w:rPr>
+        <w:t xml:space="preserve">应明显下降。结果显示，原始位置</w:t>
+      </w:r>
+      <w:r>
+        <w:t xml:space="preserve"> RMSE </w:t>
+      </w:r>
+      <w:r>
+        <w:rPr>
+          <w:rFonts w:hint="eastAsia"/>
+        </w:rPr>
+        <w:t xml:space="preserve">最低，为</w:t>
+      </w:r>
+      <w:r>
+        <w:t xml:space="preserve"> </w:t>
+      </w:r>
+      <w:r>
+        <w:rPr>
+          <w:rFonts w:hint="eastAsia"/>
+        </w:rPr>
+        <w:t xml:space="preserve">3.47；向左平移</w:t>
+      </w:r>
+      <w:r>
+        <w:t xml:space="preserve"> 1 </w:t>
+      </w:r>
+      <w:r>
+        <w:rPr>
+          <w:rFonts w:hint="eastAsia"/>
+        </w:rPr>
+        <w:t xml:space="preserve">天后</w:t>
+      </w:r>
+      <w:r>
+        <w:t xml:space="preserve"> RMSE </w:t>
+      </w:r>
+      <w:r>
+        <w:rPr>
+          <w:rFonts w:hint="eastAsia"/>
+        </w:rPr>
+        <w:t xml:space="preserve">反而升至</w:t>
+      </w:r>
+      <w:r>
+        <w:t xml:space="preserve"> </w:t>
+      </w:r>
+      <w:r>
+        <w:rPr>
+          <w:rFonts w:hint="eastAsia"/>
+        </w:rPr>
+        <w:t xml:space="preserve">3.95，向左平移</w:t>
+      </w:r>
+      <w:r>
+        <w:t xml:space="preserve"> 2 </w:t>
+      </w:r>
+      <w:r>
+        <w:rPr>
+          <w:rFonts w:hint="eastAsia"/>
+        </w:rPr>
+        <w:t xml:space="preserve">天后升至</w:t>
+      </w:r>
+      <w:r>
+        <w:t xml:space="preserve"> </w:t>
+      </w:r>
+      <w:r>
+        <w:rPr>
+          <w:rFonts w:hint="eastAsia"/>
+        </w:rPr>
+        <w:t xml:space="preserve">4.73，说明模型不存在通过整体滞后复制真实曲线获得低误差的现象。</w:t>
+      </w:r>
+    </w:p>
+    <w:p>
+      <w:pPr>
+        <w:pStyle w:val="CaptionedFigure"/>
+      </w:pPr>
+      <w:r>
+        <w:drawing>
+          <wp:inline>
+            <wp:extent cx="4587240" cy="2655770"/>
+            <wp:effectExtent b="0" l="0" r="0" t="0"/>
+            <wp:docPr descr="" title="" id="48" name="Picture"/>
+            <a:graphic>
+              <a:graphicData uri="http://schemas.openxmlformats.org/drawingml/2006/picture">
+                <pic:pic>
+                  <pic:nvPicPr>
+                    <pic:cNvPr descr="短期模型滞后平移检验.png" id="49" name="Picture"/>
+                    <pic:cNvPicPr>
+                      <a:picLocks noChangeArrowheads="1" noChangeAspect="1"/>
+                    </pic:cNvPicPr>
+                  </pic:nvPicPr>
+                  <pic:blipFill>
+                    <a:blip r:embed="rId47"/>
+                    <a:stretch>
+                      <a:fillRect/>
+                    </a:stretch>
+                  </pic:blipFill>
+                  <pic:spPr bwMode="auto">
+                    <a:xfrm>
+                      <a:off x="0" y="0"/>
+                      <a:ext cx="4587240" cy="2655770"/>
+                    </a:xfrm>
+                    <a:prstGeom prst="rect">
+                      <a:avLst/>
+                    </a:prstGeom>
+                    <a:noFill/>
+                    <a:ln w="9525">
+                      <a:noFill/>
+                      <a:headEnd/>
+                      <a:tailEnd/>
+                    </a:ln>
+                  </pic:spPr>
+                </pic:pic>
+              </a:graphicData>
+            </a:graphic>
+          </wp:inline>
+        </w:drawing>
+      </w:r>
+    </w:p>
+    <w:p>
+      <w:pPr>
+        <w:pStyle w:val="ImageCaption"/>
+      </w:pPr>
+      <w:r>
+        <w:rPr>
+          <w:rFonts w:hint="eastAsia"/>
+        </w:rPr>
+        <w:t xml:space="preserve">模型曲线平移后的</w:t>
+      </w:r>
+      <w:r>
+        <w:t xml:space="preserve"> RMSE </w:t>
+      </w:r>
+      <w:r>
+        <w:rPr>
+          <w:rFonts w:hint="eastAsia"/>
+        </w:rPr>
+        <w:t xml:space="preserve">检验。横轴为模型曲线平移天数，负数表示向左平移以检查滞后复制风险。原始位置误差最低。</w:t>
+      </w:r>
+    </w:p>
+    <w:p>
+      <w:pPr>
+        <w:pStyle w:val="BodyText"/>
+      </w:pPr>
+      <w:r>
+        <w:rPr>
+          <w:rFonts w:hint="eastAsia"/>
+        </w:rPr>
+        <w:t xml:space="preserve">进一步地，本文选取实际价格绝对变动最大的</w:t>
+      </w:r>
+      <w:r>
+        <w:t xml:space="preserve"> 10 </w:t>
+      </w:r>
+      <w:r>
+        <w:rPr>
+          <w:rFonts w:hint="eastAsia"/>
+        </w:rPr>
+        <w:t xml:space="preserve">个交易日进行拐点方向检查。模型在其中</w:t>
+      </w:r>
+      <w:r>
+        <w:t xml:space="preserve"> 8 </w:t>
+      </w:r>
+      <w:r>
+        <w:rPr>
+          <w:rFonts w:hint="eastAsia"/>
+        </w:rPr>
+        <w:t xml:space="preserve">个交易日与真实价格同向同步变化，1</w:t>
+      </w:r>
+      <w:r>
+        <w:t xml:space="preserve"> </w:t>
+      </w:r>
+      <w:r>
+        <w:rPr>
+          <w:rFonts w:hint="eastAsia"/>
+        </w:rPr>
+        <w:t xml:space="preserve">个交易日体现为提前</w:t>
+      </w:r>
+      <w:r>
+        <w:t xml:space="preserve"> 1 </w:t>
+      </w:r>
+      <w:r>
+        <w:rPr>
+          <w:rFonts w:hint="eastAsia"/>
+        </w:rPr>
+        <w:t xml:space="preserve">日变化，1</w:t>
+      </w:r>
+      <w:r>
+        <w:t xml:space="preserve"> </w:t>
+      </w:r>
+      <w:r>
+        <w:rPr>
+          <w:rFonts w:hint="eastAsia"/>
+        </w:rPr>
+        <w:t xml:space="preserve">个交易日未明显捕捉。该结果说明模型对主要突变方向具有同步解释能力，但对个别日度噪声仍存在不足。</w:t>
+      </w:r>
+    </w:p>
+    <w:p>
+      <w:pPr>
+        <w:pStyle w:val="CaptionedFigure"/>
+      </w:pPr>
+      <w:r>
+        <w:drawing>
+          <wp:inline>
+            <wp:extent cx="5067300" cy="3685309"/>
+            <wp:effectExtent b="0" l="0" r="0" t="0"/>
+            <wp:docPr descr="" title="" id="51" name="Picture"/>
+            <a:graphic>
+              <a:graphicData uri="http://schemas.openxmlformats.org/drawingml/2006/picture">
+                <pic:pic>
+                  <pic:nvPicPr>
+                    <pic:cNvPr descr="短期模型拐点局部检验.png" id="52" name="Picture"/>
+                    <pic:cNvPicPr>
+                      <a:picLocks noChangeArrowheads="1" noChangeAspect="1"/>
+                    </pic:cNvPicPr>
+                  </pic:nvPicPr>
+                  <pic:blipFill>
+                    <a:blip r:embed="rId50"/>
+                    <a:stretch>
+                      <a:fillRect/>
+                    </a:stretch>
+                  </pic:blipFill>
+                  <pic:spPr bwMode="auto">
+                    <a:xfrm>
+                      <a:off x="0" y="0"/>
+                      <a:ext cx="5067300" cy="3685309"/>
+                    </a:xfrm>
+                    <a:prstGeom prst="rect">
+                      <a:avLst/>
+                    </a:prstGeom>
+                    <a:noFill/>
+                    <a:ln w="9525">
+                      <a:noFill/>
+                      <a:headEnd/>
+                      <a:tailEnd/>
+                    </a:ln>
+                  </pic:spPr>
+                </pic:pic>
+              </a:graphicData>
+            </a:graphic>
+          </wp:inline>
+        </w:drawing>
+      </w:r>
+    </w:p>
+    <w:p>
+      <w:pPr>
+        <w:pStyle w:val="ImageCaption"/>
+      </w:pPr>
+      <w:r>
+        <w:rPr>
+          <w:rFonts w:hint="eastAsia"/>
+        </w:rPr>
+        <w:t xml:space="preserve">短期模型拐点局部检验。图中放大前期暴涨窗口和后期反转窗口，用于检查模型是否只是慢半拍跟随真实价格。</w:t>
+      </w:r>
+    </w:p>
+    <w:p>
+      <w:pPr>
+        <w:pStyle w:val="BodyText"/>
+      </w:pPr>
+      <w:r>
+        <w:rPr>
+          <w:rFonts w:hint="eastAsia"/>
+        </w:rPr>
+        <w:t xml:space="preserve">最后，本文还进行历史高波动窗口边界检验：固定霍尔木兹冲突机制参数，直接套用到</w:t>
+      </w:r>
+      <w:r>
+        <w:t xml:space="preserve"> 2020 </w:t>
+      </w:r>
+      <w:r>
+        <w:rPr>
+          <w:rFonts w:hint="eastAsia"/>
+        </w:rPr>
+        <w:t xml:space="preserve">年、2022</w:t>
+      </w:r>
+      <w:r>
+        <w:t xml:space="preserve"> </w:t>
+      </w:r>
+      <w:r>
+        <w:rPr>
+          <w:rFonts w:hint="eastAsia"/>
+        </w:rPr>
+        <w:t xml:space="preserve">年等非霍尔木兹事件窗口。结果显示，模型在这些窗口通常显著弱于朴素上一日基准。这一结果并不削弱本文结论，反而说明本文模型不是通用油价短线交易器，而是针对霍尔木兹封锁机制构建的事件解释模型。论文结论应限定在</w:t>
+      </w:r>
+      <w:r>
+        <w:rPr>
+          <w:rFonts w:hint="eastAsia"/>
+        </w:rPr>
+        <w:t xml:space="preserve">“极端地缘冲突下的条件路径解释与情景预测”</w:t>
+      </w:r>
+      <w:r>
+        <w:rPr>
+          <w:rFonts w:hint="eastAsia"/>
+        </w:rPr>
+        <w:t xml:space="preserve">，而不能外推为普通时期的万能预测模型。</w:t>
+      </w:r>
+    </w:p>
+    <w:p>
+      <w:pPr>
+        <w:pStyle w:val="CaptionedFigure"/>
+      </w:pPr>
+      <w:r>
+        <w:drawing>
+          <wp:inline>
+            <wp:extent cx="5067300" cy="3774882"/>
+            <wp:effectExtent b="0" l="0" r="0" t="0"/>
+            <wp:docPr descr="" title="" id="54" name="Picture"/>
+            <a:graphic>
+              <a:graphicData uri="http://schemas.openxmlformats.org/drawingml/2006/picture">
+                <pic:pic>
+                  <pic:nvPicPr>
+                    <pic:cNvPr descr="短期模型残差诊断增强.png" id="55" name="Picture"/>
+                    <pic:cNvPicPr>
+                      <a:picLocks noChangeArrowheads="1" noChangeAspect="1"/>
+                    </pic:cNvPicPr>
+                  </pic:nvPicPr>
+                  <pic:blipFill>
+                    <a:blip r:embed="rId53"/>
                     <a:stretch>
                       <a:fillRect/>
                     </a:stretch>
@@ -7226,18 +8217,18 @@
           <wp:inline>
             <wp:extent cx="5067300" cy="2671849"/>
             <wp:effectExtent b="0" l="0" r="0" t="0"/>
-            <wp:docPr descr="" title="" id="47" name="Picture"/>
+            <wp:docPr descr="" title="" id="57" name="Picture"/>
             <a:graphic>
               <a:graphicData uri="http://schemas.openxmlformats.org/drawingml/2006/picture">
                 <pic:pic>
                   <pic:nvPicPr>
-                    <pic:cNvPr descr="短期模型稳健性带.png" id="48" name="Picture"/>
+                    <pic:cNvPr descr="短期模型稳健性带.png" id="58" name="Picture"/>
                     <pic:cNvPicPr>
                       <a:picLocks noChangeArrowheads="1" noChangeAspect="1"/>
                     </pic:cNvPicPr>
                   </pic:nvPicPr>
                   <pic:blipFill>
-                    <a:blip r:embed="rId46"/>
+                    <a:blip r:embed="rId56"/>
                     <a:stretch>
                       <a:fillRect/>
                     </a:stretch>
@@ -7286,9 +8277,9 @@
         <w:t xml:space="preserve">上述结果说明，当前短期模型不是由某一个偶然参数点支撑，而是在最优参数附近存在稳定的优秀参数邻域。这增强了后续情景预测使用该模型作为中性基准的可信度。</w:t>
       </w:r>
     </w:p>
-    <w:bookmarkEnd w:id="49"/>
-    <w:bookmarkEnd w:id="50"/>
-    <w:bookmarkStart w:id="51" w:name="模型评价与后续扩展"/>
+    <w:bookmarkEnd w:id="59"/>
+    <w:bookmarkEnd w:id="60"/>
+    <w:bookmarkStart w:id="61" w:name="模型评价与后续扩展"/>
     <w:p>
       <w:pPr>
         <w:pStyle w:val="Heading1"/>
@@ -7328,16 +8319,7 @@
         <w:rPr>
           <w:rFonts w:hint="eastAsia"/>
         </w:rPr>
-        <w:t xml:space="preserve">个交易日，样本规模较小；其次，地缘政治风险和市场预期以参数化方式进入模型，并未使用新闻文本或期权隐含波动率等外部变量；再次，本文聚焦短期窗口，尚未展开</w:t>
-      </w:r>
-      <w:r>
-        <w:t xml:space="preserve"> 60–180 </w:t>
-      </w:r>
-      <w:r>
-        <w:rPr>
-          <w:rFonts w:hint="eastAsia"/>
-        </w:rPr>
-        <w:t xml:space="preserve">天长期情景预测。</w:t>
+        <w:t xml:space="preserve">个交易日，样本规模较小；其次，地缘政治风险和市场预期以参数化方式进入模型，并未使用新闻文本或期权隐含波动率等外部变量；再次，历史高波动窗口边界检验表明，若将霍尔木兹封锁机制参数直接套用于普通油价波动时期，模型未必优于朴素基准。因此，本文模型应被理解为事件机制模型，而不是普通时期的通用短线交易预测器。</w:t>
       </w:r>
     </w:p>
     <w:p>
@@ -7411,8 +8393,8 @@
         <w:t xml:space="preserve">的短期模型嵌入交互式展示系统，用于答辩演示和参数解释。</w:t>
       </w:r>
     </w:p>
-    <w:bookmarkEnd w:id="51"/>
-    <w:bookmarkStart w:id="53" w:name="结论"/>
+    <w:bookmarkEnd w:id="61"/>
+    <w:bookmarkStart w:id="63" w:name="结论"/>
     <w:p>
       <w:pPr>
         <w:pStyle w:val="Heading1"/>
@@ -7699,7 +8681,7 @@
       <w:r>
         <w:t xml:space="preserve"> </w:t>
       </w:r>
-      <w:hyperlink r:id="rId52">
+      <w:hyperlink r:id="rId62">
         <w:r>
           <w:rPr>
             <w:rStyle w:val="Hyperlink"/>
@@ -7708,7 +8690,7 @@
         </w:r>
       </w:hyperlink>
     </w:p>
-    <w:bookmarkEnd w:id="53"/>
+    <w:bookmarkEnd w:id="63"/>
     <w:sectPr>
       <w:footnotePr>
         <w:numRestart w:val="eachSect"/>

</xml_diff>

<commit_message>
Add fatal challenge defenses for short-term model
</commit_message>
<xml_diff>
--- a/output/final/短期动态模型论文.docx
+++ b/output/final/短期动态模型论文.docx
@@ -5505,7 +5505,7 @@
     </w:tbl>
     <w:bookmarkEnd w:id="25"/>
     <w:bookmarkEnd w:id="26"/>
-    <w:bookmarkStart w:id="60" w:name="结果分析"/>
+    <w:bookmarkStart w:id="64" w:name="结果分析"/>
     <w:p>
       <w:pPr>
         <w:pStyle w:val="Heading1"/>
@@ -7014,7 +7014,7 @@
       </w:r>
     </w:p>
     <w:bookmarkEnd w:id="43"/>
-    <w:bookmarkStart w:id="59" w:name="基于基准对比与拐点分析的防御性检验"/>
+    <w:bookmarkStart w:id="53" w:name="基于基准对比与拐点分析的防御性检验"/>
     <w:p>
       <w:pPr>
         <w:pStyle w:val="Heading2"/>
@@ -8004,6 +8004,714 @@
         <w:t xml:space="preserve">，而不能外推为普通时期的万能预测模型。</w:t>
       </w:r>
     </w:p>
+    <w:bookmarkEnd w:id="53"/>
+    <w:bookmarkStart w:id="63" w:name="参数自由度内生性与硬编码风险说明"/>
+    <w:p>
+      <w:pPr>
+        <w:pStyle w:val="Heading2"/>
+      </w:pPr>
+      <w:r>
+        <w:rPr>
+          <w:rFonts w:hint="eastAsia"/>
+        </w:rPr>
+        <w:t xml:space="preserve">参数自由度、内生性与硬编码风险说明</w:t>
+      </w:r>
+    </w:p>
+    <w:p>
+      <w:pPr>
+        <w:pStyle w:val="FirstParagraph"/>
+      </w:pPr>
+      <w:r>
+        <w:rPr>
+          <w:rFonts w:hint="eastAsia"/>
+        </w:rPr>
+        <w:t xml:space="preserve">除常规误差指标外，短期冲突窗口模型还面临更深层的可信度问题：样本期只有</w:t>
+      </w:r>
+      <w:r>
+        <w:t xml:space="preserve"> 46 </w:t>
+      </w:r>
+      <w:r>
+        <w:rPr>
+          <w:rFonts w:hint="eastAsia"/>
+        </w:rPr>
+        <w:t xml:space="preserve">个交易日，而模型包含多类物理参数和行为参数，若不加约束，确实可能落入</w:t>
+      </w:r>
+      <w:r>
+        <w:rPr>
+          <w:rFonts w:hint="eastAsia"/>
+        </w:rPr>
+        <w:t xml:space="preserve">“用足够多参数拟合任意曲线”</w:t>
+      </w:r>
+      <w:r>
+        <w:rPr>
+          <w:rFonts w:hint="eastAsia"/>
+        </w:rPr>
+        <w:t xml:space="preserve">的过拟合陷阱。因此，本文不把模型表述为无条件高精度预测器，而是把它限定为受题面物理范围约束的事件机制递推模型。</w:t>
+      </w:r>
+    </w:p>
+    <w:p>
+      <w:pPr>
+        <w:pStyle w:val="BodyText"/>
+      </w:pPr>
+      <w:r>
+        <w:rPr>
+          <w:rFonts w:hint="eastAsia"/>
+        </w:rPr>
+        <w:t xml:space="preserve">从自由度看，连续校准参数共有</w:t>
+      </w:r>
+      <w:r>
+        <w:t xml:space="preserve"> 21 </w:t>
+      </w:r>
+      <w:r>
+        <w:rPr>
+          <w:rFonts w:hint="eastAsia"/>
+        </w:rPr>
+        <w:t xml:space="preserve">个，其中</w:t>
+      </w:r>
+      <w:r>
+        <w:t xml:space="preserve"> 10 </w:t>
+      </w:r>
+      <w:r>
+        <w:rPr>
+          <w:rFonts w:hint="eastAsia"/>
+        </w:rPr>
+        <w:t xml:space="preserve">个属于题面或机制范围内的物理/半物理参数，包括供应中断、SPR</w:t>
+      </w:r>
+      <w:r>
+        <w:t xml:space="preserve"> </w:t>
+      </w:r>
+      <w:r>
+        <w:rPr>
+          <w:rFonts w:hint="eastAsia"/>
+        </w:rPr>
+        <w:t xml:space="preserve">释放、绕道能力、需求弹性、恐慌衰减和库存日缓冲上限；另外</w:t>
+      </w:r>
+      <w:r>
+        <w:t xml:space="preserve"> 11 </w:t>
+      </w:r>
+      <w:r>
+        <w:rPr>
+          <w:rFonts w:hint="eastAsia"/>
+        </w:rPr>
+        <w:t xml:space="preserve">个属于行为与价格调整参数。为避免单纯追求曲线贴合，本文采用多目标函数同时约束</w:t>
+      </w:r>
+      <w:r>
+        <w:t xml:space="preserve"> </w:t>
+      </w:r>
+      <w:r>
+        <w:rPr>
+          <w:rFonts w:hint="eastAsia"/>
+        </w:rPr>
+        <w:t xml:space="preserve">RMSE、峰值误差、末日误差、高价平台误差、低价回落误差和分段误差，并在最优参数附近进行</w:t>
+      </w:r>
+      <w:r>
+        <w:t xml:space="preserve"> </w:t>
+      </w:r>
+      <m:oMath>
+        <m:r>
+          <m:rPr>
+            <m:sty m:val="p"/>
+          </m:rPr>
+          <m:t>±</m:t>
+        </m:r>
+        <m:r>
+          <m:t>15</m:t>
+        </m:r>
+        <m:r>
+          <m:rPr>
+            <m:sty m:val="p"/>
+          </m:rPr>
+          <m:t>%</m:t>
+        </m:r>
+      </m:oMath>
+      <w:r>
+        <w:t xml:space="preserve"> </w:t>
+      </w:r>
+      <w:r>
+        <w:rPr>
+          <w:rFonts w:hint="eastAsia"/>
+        </w:rPr>
+        <w:t xml:space="preserve">压力测试。</w:t>
+      </w:r>
+    </w:p>
+    <w:p>
+      <w:pPr>
+        <w:pStyle w:val="TableCaption"/>
+      </w:pPr>
+      <m:oMath>
+        <m:r>
+          <m:rPr>
+            <m:sty m:val="p"/>
+          </m:rPr>
+          <m:t>±</m:t>
+        </m:r>
+        <m:r>
+          <m:t>15</m:t>
+        </m:r>
+        <m:r>
+          <m:rPr>
+            <m:sty m:val="p"/>
+          </m:rPr>
+          <m:t>%</m:t>
+        </m:r>
+      </m:oMath>
+      <w:r>
+        <w:t xml:space="preserve"> </w:t>
+      </w:r>
+      <w:r>
+        <w:rPr>
+          <w:rFonts w:hint="eastAsia"/>
+        </w:rPr>
+        <w:t xml:space="preserve">参数压力测试摘要</w:t>
+      </w:r>
+    </w:p>
+    <w:tbl>
+      <w:tblPr>
+        <w:tblStyle w:val="Table"/>
+        <w:tblW w:type="auto" w:w="0"/>
+        <w:tblLook w:firstRow="1" w:lastRow="0" w:firstColumn="0" w:lastColumn="0" w:noHBand="0" w:noVBand="0" w:val="0020"/>
+        <w:tblCaption w:val="\pm 15\% 参数压力测试摘要"/>
+      </w:tblPr>
+      <w:tblGrid>
+        <w:gridCol w:w="1584"/>
+        <w:gridCol w:w="1584"/>
+        <w:gridCol w:w="1584"/>
+        <w:gridCol w:w="1584"/>
+        <w:gridCol w:w="1584"/>
+      </w:tblGrid>
+      <w:tr>
+        <w:trPr>
+          <w:tblHeader w:val="on"/>
+        </w:trPr>
+        <w:tc>
+          <w:tcPr/>
+          <w:p>
+            <w:pPr>
+              <w:pStyle w:val="Compact"/>
+              <w:jc w:val="left"/>
+            </w:pPr>
+            <w:r>
+              <w:rPr>
+                <w:rFonts w:hint="eastAsia"/>
+              </w:rPr>
+              <w:t xml:space="preserve">指标</w:t>
+            </w:r>
+          </w:p>
+        </w:tc>
+        <w:tc>
+          <w:tcPr/>
+          <w:p>
+            <w:pPr>
+              <w:pStyle w:val="Compact"/>
+              <w:jc w:val="right"/>
+            </w:pPr>
+            <w:r>
+              <w:rPr>
+                <w:rFonts w:hint="eastAsia"/>
+              </w:rPr>
+              <w:t xml:space="preserve">均值</w:t>
+            </w:r>
+          </w:p>
+        </w:tc>
+        <w:tc>
+          <w:tcPr/>
+          <w:p>
+            <w:pPr>
+              <w:pStyle w:val="Compact"/>
+              <w:jc w:val="right"/>
+            </w:pPr>
+            <w:r>
+              <w:rPr>
+                <w:rFonts w:hint="eastAsia"/>
+              </w:rPr>
+              <w:t xml:space="preserve">中位数</w:t>
+            </w:r>
+          </w:p>
+        </w:tc>
+        <w:tc>
+          <w:tcPr/>
+          <w:p>
+            <w:pPr>
+              <w:pStyle w:val="Compact"/>
+              <w:jc w:val="right"/>
+            </w:pPr>
+            <w:r>
+              <w:rPr>
+                <w:rFonts w:hint="eastAsia"/>
+              </w:rPr>
+              <w:t xml:space="preserve">90%分位数</w:t>
+            </w:r>
+          </w:p>
+        </w:tc>
+        <w:tc>
+          <w:tcPr/>
+          <w:p>
+            <w:pPr>
+              <w:pStyle w:val="Compact"/>
+              <w:jc w:val="right"/>
+            </w:pPr>
+            <w:r>
+              <w:rPr>
+                <w:rFonts w:hint="eastAsia"/>
+              </w:rPr>
+              <w:t xml:space="preserve">最大值</w:t>
+            </w:r>
+          </w:p>
+        </w:tc>
+      </w:tr>
+      <w:tr>
+        <w:tc>
+          <w:tcPr/>
+          <w:p>
+            <w:pPr>
+              <w:pStyle w:val="Compact"/>
+              <w:jc w:val="left"/>
+            </w:pPr>
+            <w:r>
+              <w:t xml:space="preserve">RMSE</w:t>
+            </w:r>
+          </w:p>
+        </w:tc>
+        <w:tc>
+          <w:tcPr/>
+          <w:p>
+            <w:pPr>
+              <w:pStyle w:val="Compact"/>
+              <w:jc w:val="right"/>
+            </w:pPr>
+            <w:r>
+              <w:t xml:space="preserve">4.96</w:t>
+            </w:r>
+          </w:p>
+        </w:tc>
+        <w:tc>
+          <w:tcPr/>
+          <w:p>
+            <w:pPr>
+              <w:pStyle w:val="Compact"/>
+              <w:jc w:val="right"/>
+            </w:pPr>
+            <w:r>
+              <w:t xml:space="preserve">4.74</w:t>
+            </w:r>
+          </w:p>
+        </w:tc>
+        <w:tc>
+          <w:tcPr/>
+          <w:p>
+            <w:pPr>
+              <w:pStyle w:val="Compact"/>
+              <w:jc w:val="right"/>
+            </w:pPr>
+            <w:r>
+              <w:t xml:space="preserve">6.33</w:t>
+            </w:r>
+          </w:p>
+        </w:tc>
+        <w:tc>
+          <w:tcPr/>
+          <w:p>
+            <w:pPr>
+              <w:pStyle w:val="Compact"/>
+              <w:jc w:val="right"/>
+            </w:pPr>
+            <w:r>
+              <w:t xml:space="preserve">10.27</w:t>
+            </w:r>
+          </w:p>
+        </w:tc>
+      </w:tr>
+      <w:tr>
+        <w:tc>
+          <w:tcPr/>
+          <w:p>
+            <w:pPr>
+              <w:pStyle w:val="Compact"/>
+              <w:jc w:val="left"/>
+            </w:pPr>
+            <w:r>
+              <w:rPr>
+                <w:rFonts w:hint="eastAsia"/>
+              </w:rPr>
+              <w:t xml:space="preserve">模拟峰值</w:t>
+            </w:r>
+          </w:p>
+        </w:tc>
+        <w:tc>
+          <w:tcPr/>
+          <w:p>
+            <w:pPr>
+              <w:pStyle w:val="Compact"/>
+              <w:jc w:val="right"/>
+            </w:pPr>
+            <w:r>
+              <w:t xml:space="preserve">110.39</w:t>
+            </w:r>
+          </w:p>
+        </w:tc>
+        <w:tc>
+          <w:tcPr/>
+          <w:p>
+            <w:pPr>
+              <w:pStyle w:val="Compact"/>
+              <w:jc w:val="right"/>
+            </w:pPr>
+            <w:r>
+              <w:t xml:space="preserve">110.30</w:t>
+            </w:r>
+          </w:p>
+        </w:tc>
+        <w:tc>
+          <w:tcPr/>
+          <w:p>
+            <w:pPr>
+              <w:pStyle w:val="Compact"/>
+              <w:jc w:val="right"/>
+            </w:pPr>
+            <w:r>
+              <w:t xml:space="preserve">114.16</w:t>
+            </w:r>
+          </w:p>
+        </w:tc>
+        <w:tc>
+          <w:tcPr/>
+          <w:p>
+            <w:pPr>
+              <w:pStyle w:val="Compact"/>
+              <w:jc w:val="right"/>
+            </w:pPr>
+            <w:r>
+              <w:t xml:space="preserve">119.62</w:t>
+            </w:r>
+          </w:p>
+        </w:tc>
+      </w:tr>
+      <w:tr>
+        <w:tc>
+          <w:tcPr/>
+          <w:p>
+            <w:pPr>
+              <w:pStyle w:val="Compact"/>
+              <w:jc w:val="left"/>
+            </w:pPr>
+            <w:r>
+              <w:rPr>
+                <w:rFonts w:hint="eastAsia"/>
+              </w:rPr>
+              <w:t xml:space="preserve">模拟末日价格</w:t>
+            </w:r>
+          </w:p>
+        </w:tc>
+        <w:tc>
+          <w:tcPr/>
+          <w:p>
+            <w:pPr>
+              <w:pStyle w:val="Compact"/>
+              <w:jc w:val="right"/>
+            </w:pPr>
+            <w:r>
+              <w:t xml:space="preserve">110.39</w:t>
+            </w:r>
+          </w:p>
+        </w:tc>
+        <w:tc>
+          <w:tcPr/>
+          <w:p>
+            <w:pPr>
+              <w:pStyle w:val="Compact"/>
+              <w:jc w:val="right"/>
+            </w:pPr>
+            <w:r>
+              <w:t xml:space="preserve">110.30</w:t>
+            </w:r>
+          </w:p>
+        </w:tc>
+        <w:tc>
+          <w:tcPr/>
+          <w:p>
+            <w:pPr>
+              <w:pStyle w:val="Compact"/>
+              <w:jc w:val="right"/>
+            </w:pPr>
+            <w:r>
+              <w:t xml:space="preserve">114.16</w:t>
+            </w:r>
+          </w:p>
+        </w:tc>
+        <w:tc>
+          <w:tcPr/>
+          <w:p>
+            <w:pPr>
+              <w:pStyle w:val="Compact"/>
+              <w:jc w:val="right"/>
+            </w:pPr>
+            <w:r>
+              <w:t xml:space="preserve">119.62</w:t>
+            </w:r>
+          </w:p>
+        </w:tc>
+      </w:tr>
+      <w:tr>
+        <w:tc>
+          <w:tcPr/>
+          <w:p>
+            <w:pPr>
+              <w:pStyle w:val="Compact"/>
+              <w:jc w:val="left"/>
+            </w:pPr>
+            <w:r>
+              <w:rPr>
+                <w:rFonts w:hint="eastAsia"/>
+              </w:rPr>
+              <w:t xml:space="preserve">高价平台</w:t>
+            </w:r>
+            <w:r>
+              <w:t xml:space="preserve"> RMSE</w:t>
+            </w:r>
+          </w:p>
+        </w:tc>
+        <w:tc>
+          <w:tcPr/>
+          <w:p>
+            <w:pPr>
+              <w:pStyle w:val="Compact"/>
+              <w:jc w:val="right"/>
+            </w:pPr>
+            <w:r>
+              <w:t xml:space="preserve">3.90</w:t>
+            </w:r>
+          </w:p>
+        </w:tc>
+        <w:tc>
+          <w:tcPr/>
+          <w:p>
+            <w:pPr>
+              <w:pStyle w:val="Compact"/>
+              <w:jc w:val="right"/>
+            </w:pPr>
+            <w:r>
+              <w:t xml:space="preserve">3.36</w:t>
+            </w:r>
+          </w:p>
+        </w:tc>
+        <w:tc>
+          <w:tcPr/>
+          <w:p>
+            <w:pPr>
+              <w:pStyle w:val="Compact"/>
+              <w:jc w:val="right"/>
+            </w:pPr>
+            <w:r>
+              <w:t xml:space="preserve">6.84</w:t>
+            </w:r>
+          </w:p>
+        </w:tc>
+        <w:tc>
+          <w:tcPr/>
+          <w:p>
+            <w:pPr>
+              <w:pStyle w:val="Compact"/>
+              <w:jc w:val="right"/>
+            </w:pPr>
+            <w:r>
+              <w:t xml:space="preserve">11.84</w:t>
+            </w:r>
+          </w:p>
+        </w:tc>
+      </w:tr>
+      <w:tr>
+        <w:tc>
+          <w:tcPr/>
+          <w:p>
+            <w:pPr>
+              <w:pStyle w:val="Compact"/>
+              <w:jc w:val="left"/>
+            </w:pPr>
+            <w:r>
+              <w:rPr>
+                <w:rFonts w:hint="eastAsia"/>
+              </w:rPr>
+              <w:t xml:space="preserve">低价回落</w:t>
+            </w:r>
+            <w:r>
+              <w:t xml:space="preserve"> RMSE</w:t>
+            </w:r>
+          </w:p>
+        </w:tc>
+        <w:tc>
+          <w:tcPr/>
+          <w:p>
+            <w:pPr>
+              <w:pStyle w:val="Compact"/>
+              <w:jc w:val="right"/>
+            </w:pPr>
+            <w:r>
+              <w:t xml:space="preserve">4.98</w:t>
+            </w:r>
+          </w:p>
+        </w:tc>
+        <w:tc>
+          <w:tcPr/>
+          <w:p>
+            <w:pPr>
+              <w:pStyle w:val="Compact"/>
+              <w:jc w:val="right"/>
+            </w:pPr>
+            <w:r>
+              <w:t xml:space="preserve">4.63</w:t>
+            </w:r>
+          </w:p>
+        </w:tc>
+        <w:tc>
+          <w:tcPr/>
+          <w:p>
+            <w:pPr>
+              <w:pStyle w:val="Compact"/>
+              <w:jc w:val="right"/>
+            </w:pPr>
+            <w:r>
+              <w:t xml:space="preserve">7.71</w:t>
+            </w:r>
+          </w:p>
+        </w:tc>
+        <w:tc>
+          <w:tcPr/>
+          <w:p>
+            <w:pPr>
+              <w:pStyle w:val="Compact"/>
+              <w:jc w:val="right"/>
+            </w:pPr>
+            <w:r>
+              <w:t xml:space="preserve">11.60</w:t>
+            </w:r>
+          </w:p>
+        </w:tc>
+      </w:tr>
+    </w:tbl>
+    <w:p>
+      <w:pPr>
+        <w:pStyle w:val="BodyText"/>
+      </w:pPr>
+      <w:r>
+        <w:rPr>
+          <w:rFonts w:hint="eastAsia"/>
+        </w:rPr>
+        <w:t xml:space="preserve">压力测试显示，在</w:t>
+      </w:r>
+      <w:r>
+        <w:t xml:space="preserve"> 1000 </w:t>
+      </w:r>
+      <w:r>
+        <w:rPr>
+          <w:rFonts w:hint="eastAsia"/>
+        </w:rPr>
+        <w:t xml:space="preserve">组</w:t>
+      </w:r>
+      <w:r>
+        <w:t xml:space="preserve"> </w:t>
+      </w:r>
+      <m:oMath>
+        <m:r>
+          <m:rPr>
+            <m:sty m:val="p"/>
+          </m:rPr>
+          <m:t>±</m:t>
+        </m:r>
+        <m:r>
+          <m:t>15</m:t>
+        </m:r>
+        <m:r>
+          <m:rPr>
+            <m:sty m:val="p"/>
+          </m:rPr>
+          <m:t>%</m:t>
+        </m:r>
+      </m:oMath>
+      <w:r>
+        <w:t xml:space="preserve"> </w:t>
+      </w:r>
+      <w:r>
+        <w:rPr>
+          <w:rFonts w:hint="eastAsia"/>
+        </w:rPr>
+        <w:t xml:space="preserve">扰动中，60.5%</w:t>
+      </w:r>
+      <w:r>
+        <w:t xml:space="preserve"> </w:t>
+      </w:r>
+      <w:r>
+        <w:rPr>
+          <w:rFonts w:hint="eastAsia"/>
+        </w:rPr>
+        <w:t xml:space="preserve">的样本</w:t>
+      </w:r>
+      <w:r>
+        <w:t xml:space="preserve"> RMSE </w:t>
+      </w:r>
+      <w:r>
+        <w:rPr>
+          <w:rFonts w:hint="eastAsia"/>
+        </w:rPr>
+        <w:t xml:space="preserve">不高于</w:t>
+      </w:r>
+      <w:r>
+        <w:t xml:space="preserve"> </w:t>
+      </w:r>
+      <w:r>
+        <w:rPr>
+          <w:rFonts w:hint="eastAsia"/>
+        </w:rPr>
+        <w:t xml:space="preserve">5，96.9%</w:t>
+      </w:r>
+      <w:r>
+        <w:t xml:space="preserve"> </w:t>
+      </w:r>
+      <w:r>
+        <w:rPr>
+          <w:rFonts w:hint="eastAsia"/>
+        </w:rPr>
+        <w:t xml:space="preserve">的样本模拟峰值落在</w:t>
+      </w:r>
+      <w:r>
+        <w:t xml:space="preserve"> 105–125 </w:t>
+      </w:r>
+      <w:r>
+        <w:rPr>
+          <w:rFonts w:hint="eastAsia"/>
+        </w:rPr>
+        <w:t xml:space="preserve">美元/桶区间，全部样本末日价格落在</w:t>
+      </w:r>
+      <w:r>
+        <w:t xml:space="preserve"> 100–120 </w:t>
+      </w:r>
+      <w:r>
+        <w:rPr>
+          <w:rFonts w:hint="eastAsia"/>
+        </w:rPr>
+        <w:t xml:space="preserve">美元/桶区间。这说明价格平台不是唯一一组</w:t>
+      </w:r>
+      <w:r>
+        <w:rPr>
+          <w:rFonts w:hint="eastAsia"/>
+        </w:rPr>
+        <w:t xml:space="preserve">“神奇参数”</w:t>
+      </w:r>
+      <w:r>
+        <w:rPr>
+          <w:rFonts w:hint="eastAsia"/>
+        </w:rPr>
+        <w:t xml:space="preserve">的偶然结果；但同时也说明较大扰动会削弱</w:t>
+      </w:r>
+      <w:r>
+        <w:t xml:space="preserve"> RMSE </w:t>
+      </w:r>
+      <w:r>
+        <w:rPr>
+          <w:rFonts w:hint="eastAsia"/>
+        </w:rPr>
+        <w:t xml:space="preserve">表现，因此本文只主张模型具有结构性稳健性，而不主张其具备任意参数下的高精度预测能力。</w:t>
+      </w:r>
+    </w:p>
     <w:p>
       <w:pPr>
         <w:pStyle w:val="CaptionedFigure"/>
@@ -8011,20 +8719,401 @@
       <w:r>
         <w:drawing>
           <wp:inline>
-            <wp:extent cx="5067300" cy="3774882"/>
+            <wp:extent cx="5067300" cy="2211185"/>
             <wp:effectExtent b="0" l="0" r="0" t="0"/>
-            <wp:docPr descr="" title="" id="54" name="Picture"/>
+            <wp:docPr descr="" title="" id="55" name="Picture"/>
             <a:graphic>
               <a:graphicData uri="http://schemas.openxmlformats.org/drawingml/2006/picture">
                 <pic:pic>
                   <pic:nvPicPr>
-                    <pic:cNvPr descr="短期模型残差诊断增强.png" id="55" name="Picture"/>
+                    <pic:cNvPr descr="短期模型过拟合压力测试.png" id="56" name="Picture"/>
                     <pic:cNvPicPr>
                       <a:picLocks noChangeArrowheads="1" noChangeAspect="1"/>
                     </pic:cNvPicPr>
                   </pic:nvPicPr>
                   <pic:blipFill>
-                    <a:blip r:embed="rId53"/>
+                    <a:blip r:embed="rId54"/>
+                    <a:stretch>
+                      <a:fillRect/>
+                    </a:stretch>
+                  </pic:blipFill>
+                  <pic:spPr bwMode="auto">
+                    <a:xfrm>
+                      <a:off x="0" y="0"/>
+                      <a:ext cx="5067300" cy="2211185"/>
+                    </a:xfrm>
+                    <a:prstGeom prst="rect">
+                      <a:avLst/>
+                    </a:prstGeom>
+                    <a:noFill/>
+                    <a:ln w="9525">
+                      <a:noFill/>
+                      <a:headEnd/>
+                      <a:tailEnd/>
+                    </a:ln>
+                  </pic:spPr>
+                </pic:pic>
+              </a:graphicData>
+            </a:graphic>
+          </wp:inline>
+        </w:drawing>
+      </w:r>
+    </w:p>
+    <w:p>
+      <w:pPr>
+        <w:pStyle w:val="ImageCaption"/>
+      </w:pPr>
+      <w:r>
+        <w:rPr>
+          <w:rFonts w:hint="eastAsia"/>
+        </w:rPr>
+        <w:t xml:space="preserve">短期模型</w:t>
+      </w:r>
+      <w:r>
+        <w:t xml:space="preserve"> </w:t>
+      </w:r>
+      <m:oMath>
+        <m:r>
+          <m:rPr>
+            <m:sty m:val="p"/>
+          </m:rPr>
+          <m:t>±</m:t>
+        </m:r>
+        <m:r>
+          <m:t>15</m:t>
+        </m:r>
+        <m:r>
+          <m:rPr>
+            <m:sty m:val="p"/>
+          </m:rPr>
+          <m:t>%</m:t>
+        </m:r>
+      </m:oMath>
+      <w:r>
+        <w:t xml:space="preserve"> </w:t>
+      </w:r>
+      <w:r>
+        <w:rPr>
+          <w:rFonts w:hint="eastAsia"/>
+        </w:rPr>
+        <w:t xml:space="preserve">参数压力测试。左图为</w:t>
+      </w:r>
+      <w:r>
+        <w:t xml:space="preserve"> RMSE </w:t>
+      </w:r>
+      <w:r>
+        <w:rPr>
+          <w:rFonts w:hint="eastAsia"/>
+        </w:rPr>
+        <w:t xml:space="preserve">分布，右图为模拟峰值分布，用于检查价格平台是否依赖单一参数点。</w:t>
+      </w:r>
+    </w:p>
+    <w:p>
+      <w:pPr>
+        <w:pStyle w:val="BodyText"/>
+      </w:pPr>
+      <w:r>
+        <w:rPr>
+          <w:rFonts w:hint="eastAsia"/>
+        </w:rPr>
+        <w:t xml:space="preserve">关于恐慌变量的内生性问题，本文当前没有使用</w:t>
+      </w:r>
+      <w:r>
+        <w:t xml:space="preserve"> AI Agent </w:t>
+      </w:r>
+      <w:r>
+        <w:rPr>
+          <w:rFonts w:hint="eastAsia"/>
+        </w:rPr>
+        <w:t xml:space="preserve">新闻爬虫数据，也没有把新闻情绪序列作为模型输入。模型中的恐慌初始强度和恐慌衰减速度只是用于刻画冲突初期风险溢价衰减的校准参数，而不是由新闻文本统计得到的外生恐慌指数。因此，</w:t>
+      </w:r>
+      <w:r>
+        <w:rPr>
+          <w:rFonts w:hint="eastAsia"/>
+        </w:rPr>
+        <w:t xml:space="preserve">“油价上涨导致新闻恐慌、新闻恐慌再解释油价上涨”</w:t>
+      </w:r>
+      <w:r>
+        <w:rPr>
+          <w:rFonts w:hint="eastAsia"/>
+        </w:rPr>
+        <w:t xml:space="preserve">的同日反馈循环并不构成当前模型的直接识别问题。若后续加入新闻情绪模块，则必须使用</w:t>
+      </w:r>
+      <w:r>
+        <w:t xml:space="preserve"> </w:t>
+      </w:r>
+      <m:oMath>
+        <m:r>
+          <m:t>t</m:t>
+        </m:r>
+        <m:r>
+          <m:rPr>
+            <m:sty m:val="p"/>
+          </m:rPr>
+          <m:t>−</m:t>
+        </m:r>
+        <m:r>
+          <m:t>1</m:t>
+        </m:r>
+      </m:oMath>
+      <w:r>
+        <w:t xml:space="preserve"> </w:t>
+      </w:r>
+      <w:r>
+        <w:rPr>
+          <w:rFonts w:hint="eastAsia"/>
+        </w:rPr>
+        <w:t xml:space="preserve">期或闭市前新闻解释</w:t>
+      </w:r>
+      <w:r>
+        <w:t xml:space="preserve"> </w:t>
+      </w:r>
+      <m:oMath>
+        <m:r>
+          <m:t>t</m:t>
+        </m:r>
+      </m:oMath>
+      <w:r>
+        <w:t xml:space="preserve"> </w:t>
+      </w:r>
+      <w:r>
+        <w:rPr>
+          <w:rFonts w:hint="eastAsia"/>
+        </w:rPr>
+        <w:t xml:space="preserve">日价格，并进行格兰杰因果或滞后相关检验，不能直接把当日新闻情绪当作外生预测变量。</w:t>
+      </w:r>
+    </w:p>
+    <w:p>
+      <w:pPr>
+        <w:pStyle w:val="BodyText"/>
+      </w:pPr>
+      <w:r>
+        <w:rPr>
+          <w:rFonts w:hint="eastAsia"/>
+        </w:rPr>
+        <w:t xml:space="preserve">关于</w:t>
+      </w:r>
+      <w:r>
+        <w:t xml:space="preserve"> 200 </w:t>
+      </w:r>
+      <w:r>
+        <w:rPr>
+          <w:rFonts w:hint="eastAsia"/>
+        </w:rPr>
+        <w:t xml:space="preserve">美元反事实基准，本文也不应把它写成现实市场必然价格。传统供需模型的高价结果来自低短期弹性条件下的反事实上界，而不是现实预测。弹性敏感性检验显示，当需求价格弹性由</w:t>
+      </w:r>
+      <w:r>
+        <w:t xml:space="preserve"> </w:t>
+      </w:r>
+      <m:oMath>
+        <m:r>
+          <m:rPr>
+            <m:sty m:val="p"/>
+          </m:rPr>
+          <m:t>−</m:t>
+        </m:r>
+        <m:r>
+          <m:t>0.05</m:t>
+        </m:r>
+      </m:oMath>
+      <w:r>
+        <w:t xml:space="preserve"> </w:t>
+      </w:r>
+      <w:r>
+        <w:rPr>
+          <w:rFonts w:hint="eastAsia"/>
+        </w:rPr>
+        <w:t xml:space="preserve">放宽至</w:t>
+      </w:r>
+      <w:r>
+        <w:t xml:space="preserve"> </w:t>
+      </w:r>
+      <m:oMath>
+        <m:r>
+          <m:rPr>
+            <m:sty m:val="p"/>
+          </m:rPr>
+          <m:t>−</m:t>
+        </m:r>
+        <m:r>
+          <m:t>0.25</m:t>
+        </m:r>
+      </m:oMath>
+      <w:r>
+        <w:t xml:space="preserve"> </w:t>
+      </w:r>
+      <w:r>
+        <w:rPr>
+          <w:rFonts w:hint="eastAsia"/>
+        </w:rPr>
+        <w:t xml:space="preserve">或</w:t>
+      </w:r>
+      <w:r>
+        <w:t xml:space="preserve"> </w:t>
+      </w:r>
+      <m:oMath>
+        <m:r>
+          <m:rPr>
+            <m:sty m:val="p"/>
+          </m:rPr>
+          <m:t>−</m:t>
+        </m:r>
+        <m:r>
+          <m:t>0.35</m:t>
+        </m:r>
+      </m:oMath>
+      <w:r>
+        <w:t xml:space="preserve"> </w:t>
+      </w:r>
+      <w:r>
+        <w:rPr>
+          <w:rFonts w:hint="eastAsia"/>
+        </w:rPr>
+        <w:t xml:space="preserve">时，传统线性化模型价格会明显下降，部分情景已经接近或低于</w:t>
+      </w:r>
+      <w:r>
+        <w:t xml:space="preserve"> 120 </w:t>
+      </w:r>
+      <w:r>
+        <w:rPr>
+          <w:rFonts w:hint="eastAsia"/>
+        </w:rPr>
+        <w:t xml:space="preserve">美元/桶。因此，本文真正要论证的不是</w:t>
+      </w:r>
+      <w:r>
+        <w:rPr>
+          <w:rFonts w:hint="eastAsia"/>
+        </w:rPr>
+        <w:t xml:space="preserve">“油价必然应该超过</w:t>
+      </w:r>
+      <w:r>
+        <w:t xml:space="preserve"> 200 </w:t>
+      </w:r>
+      <w:r>
+        <w:rPr>
+          <w:rFonts w:hint="eastAsia"/>
+        </w:rPr>
+        <w:t xml:space="preserve">美元”</w:t>
+      </w:r>
+      <w:r>
+        <w:rPr>
+          <w:rFonts w:hint="eastAsia"/>
+        </w:rPr>
+        <w:t xml:space="preserve">，而是</w:t>
+      </w:r>
+      <w:r>
+        <w:rPr>
+          <w:rFonts w:hint="eastAsia"/>
+        </w:rPr>
+        <w:t xml:space="preserve">“低短期弹性静态供需模型会显著高估现实价格，必须引入库存、SPR、绕道、需求收缩和预期修复等动态机制解释现实平台”</w:t>
+      </w:r>
+      <w:r>
+        <w:t xml:space="preserve">。</w:t>
+      </w:r>
+    </w:p>
+    <w:p>
+      <w:pPr>
+        <w:pStyle w:val="BodyText"/>
+      </w:pPr>
+      <w:r>
+        <w:rPr>
+          <w:rFonts w:hint="eastAsia"/>
+        </w:rPr>
+        <w:t xml:space="preserve">最后，本文对代码进行硬编码审计。短期动态递推函数中不存在</w:t>
+      </w:r>
+      <w:r>
+        <w:t xml:space="preserve"> </w:t>
+      </w:r>
+      <m:oMath>
+        <m:sSub>
+          <m:e>
+            <m:r>
+              <m:t>P</m:t>
+            </m:r>
+          </m:e>
+          <m:sub>
+            <m:r>
+              <m:t>t</m:t>
+            </m:r>
+          </m:sub>
+        </m:sSub>
+        <m:r>
+          <m:rPr>
+            <m:sty m:val="p"/>
+          </m:rPr>
+          <m:t>&gt;</m:t>
+        </m:r>
+        <m:r>
+          <m:t>120</m:t>
+        </m:r>
+      </m:oMath>
+      <w:r>
+        <w:t xml:space="preserve"> </w:t>
+      </w:r>
+      <w:r>
+        <w:rPr>
+          <w:rFonts w:hint="eastAsia"/>
+        </w:rPr>
+        <w:t xml:space="preserve">后强制压低价格的条件分支，也没有将</w:t>
+      </w:r>
+      <w:r>
+        <w:t xml:space="preserve"> 120 </w:t>
+      </w:r>
+      <w:r>
+        <w:rPr>
+          <w:rFonts w:hint="eastAsia"/>
+        </w:rPr>
+        <w:t xml:space="preserve">美元设置为价格上限。模型中的数值安全裁剪上限为</w:t>
+      </w:r>
+      <w:r>
+        <w:t xml:space="preserve"> 180 </w:t>
+      </w:r>
+      <w:r>
+        <w:rPr>
+          <w:rFonts w:hint="eastAsia"/>
+        </w:rPr>
+        <w:t xml:space="preserve">美元/桶，校准路径中从未触发；110–120</w:t>
+      </w:r>
+      <w:r>
+        <w:t xml:space="preserve"> </w:t>
+      </w:r>
+      <w:r>
+        <w:rPr>
+          <w:rFonts w:hint="eastAsia"/>
+        </w:rPr>
+        <w:t xml:space="preserve">美元只作为题面观测参考区间出现在图表阴影和展示配置中，不参与价格递推计算。需要强调的是，当前模型也不是严格意义上的微观多智能体涌现模型，更准确的表述应是机制递推模型；本文可以证明</w:t>
+      </w:r>
+      <w:r>
+        <w:t xml:space="preserve"> 120 </w:t>
+      </w:r>
+      <w:r>
+        <w:rPr>
+          <w:rFonts w:hint="eastAsia"/>
+        </w:rPr>
+        <w:t xml:space="preserve">美元平台不是代码硬上限，但不应声称已经实现了多智能体动态纳什均衡。</w:t>
+      </w:r>
+    </w:p>
+    <w:p>
+      <w:pPr>
+        <w:pStyle w:val="CaptionedFigure"/>
+      </w:pPr>
+      <w:r>
+        <w:drawing>
+          <wp:inline>
+            <wp:extent cx="5067300" cy="3774882"/>
+            <wp:effectExtent b="0" l="0" r="0" t="0"/>
+            <wp:docPr descr="" title="" id="58" name="Picture"/>
+            <a:graphic>
+              <a:graphicData uri="http://schemas.openxmlformats.org/drawingml/2006/picture">
+                <pic:pic>
+                  <pic:nvPicPr>
+                    <pic:cNvPr descr="短期模型残差诊断增强.png" id="59" name="Picture"/>
+                    <pic:cNvPicPr>
+                      <a:picLocks noChangeArrowheads="1" noChangeAspect="1"/>
+                    </pic:cNvPicPr>
+                  </pic:nvPicPr>
+                  <pic:blipFill>
+                    <a:blip r:embed="rId57"/>
                     <a:stretch>
                       <a:fillRect/>
                     </a:stretch>
@@ -8217,18 +9306,18 @@
           <wp:inline>
             <wp:extent cx="5067300" cy="2671849"/>
             <wp:effectExtent b="0" l="0" r="0" t="0"/>
-            <wp:docPr descr="" title="" id="57" name="Picture"/>
+            <wp:docPr descr="" title="" id="61" name="Picture"/>
             <a:graphic>
               <a:graphicData uri="http://schemas.openxmlformats.org/drawingml/2006/picture">
                 <pic:pic>
                   <pic:nvPicPr>
-                    <pic:cNvPr descr="短期模型稳健性带.png" id="58" name="Picture"/>
+                    <pic:cNvPr descr="短期模型稳健性带.png" id="62" name="Picture"/>
                     <pic:cNvPicPr>
                       <a:picLocks noChangeArrowheads="1" noChangeAspect="1"/>
                     </pic:cNvPicPr>
                   </pic:nvPicPr>
                   <pic:blipFill>
-                    <a:blip r:embed="rId56"/>
+                    <a:blip r:embed="rId60"/>
                     <a:stretch>
                       <a:fillRect/>
                     </a:stretch>
@@ -8277,9 +9366,9 @@
         <w:t xml:space="preserve">上述结果说明，当前短期模型不是由某一个偶然参数点支撑，而是在最优参数附近存在稳定的优秀参数邻域。这增强了后续情景预测使用该模型作为中性基准的可信度。</w:t>
       </w:r>
     </w:p>
-    <w:bookmarkEnd w:id="59"/>
-    <w:bookmarkEnd w:id="60"/>
-    <w:bookmarkStart w:id="61" w:name="模型评价与后续扩展"/>
+    <w:bookmarkEnd w:id="63"/>
+    <w:bookmarkEnd w:id="64"/>
+    <w:bookmarkStart w:id="65" w:name="模型评价与后续扩展"/>
     <w:p>
       <w:pPr>
         <w:pStyle w:val="Heading1"/>
@@ -8319,7 +9408,33 @@
         <w:rPr>
           <w:rFonts w:hint="eastAsia"/>
         </w:rPr>
-        <w:t xml:space="preserve">个交易日，样本规模较小；其次，地缘政治风险和市场预期以参数化方式进入模型，并未使用新闻文本或期权隐含波动率等外部变量；再次，历史高波动窗口边界检验表明，若将霍尔木兹封锁机制参数直接套用于普通油价波动时期，模型未必优于朴素基准。因此，本文模型应被理解为事件机制模型，而不是普通时期的通用短线交易预测器。</w:t>
+        <w:t xml:space="preserve">个交易日，而连续校准参数较多，存在过拟合风险；本文通过题面范围约束、多目标函数、局部扰动、</w:t>
+      </w:r>
+      <m:oMath>
+        <m:r>
+          <m:rPr>
+            <m:sty m:val="p"/>
+          </m:rPr>
+          <m:t>±</m:t>
+        </m:r>
+        <m:r>
+          <m:t>15</m:t>
+        </m:r>
+        <m:r>
+          <m:rPr>
+            <m:sty m:val="p"/>
+          </m:rPr>
+          <m:t>%</m:t>
+        </m:r>
+      </m:oMath>
+      <w:r>
+        <w:t xml:space="preserve"> </w:t>
+      </w:r>
+      <w:r>
+        <w:rPr>
+          <w:rFonts w:hint="eastAsia"/>
+        </w:rPr>
+        <w:t xml:space="preserve">压力测试和历史窗口边界检验降低这一风险，但不能把模型解释为通用交易预测器。其次，地缘政治风险和市场预期以参数化方式进入模型，并未使用新闻文本或期权隐含波动率等外部变量；因此当前模型不存在新闻情绪内生性输入问题，但也不能声称利用了外部情绪数据。再次，历史高波动窗口边界检验表明，若将霍尔木兹封锁机制参数直接套用于普通油价波动时期，模型未必优于朴素基准。因此，本文模型应被理解为事件机制模型，而不是普通时期的通用短线交易预测器。</w:t>
       </w:r>
     </w:p>
     <w:p>
@@ -8393,8 +9508,8 @@
         <w:t xml:space="preserve">的短期模型嵌入交互式展示系统，用于答辩演示和参数解释。</w:t>
       </w:r>
     </w:p>
-    <w:bookmarkEnd w:id="61"/>
-    <w:bookmarkStart w:id="63" w:name="结论"/>
+    <w:bookmarkEnd w:id="65"/>
+    <w:bookmarkStart w:id="67" w:name="结论"/>
     <w:p>
       <w:pPr>
         <w:pStyle w:val="Heading1"/>
@@ -8681,7 +9796,7 @@
       <w:r>
         <w:t xml:space="preserve"> </w:t>
       </w:r>
-      <w:hyperlink r:id="rId62">
+      <w:hyperlink r:id="rId66">
         <w:r>
           <w:rPr>
             <w:rStyle w:val="Hyperlink"/>
@@ -8690,7 +9805,7 @@
         </w:r>
       </w:hyperlink>
     </w:p>
-    <w:bookmarkEnd w:id="63"/>
+    <w:bookmarkEnd w:id="67"/>
     <w:sectPr>
       <w:footnotePr>
         <w:numRestart w:val="eachSect"/>

</xml_diff>

<commit_message>
Reframe short-term model and add mechanism ablation
</commit_message>
<xml_diff>
--- a/output/final/短期动态模型论文.docx
+++ b/output/final/短期动态模型论文.docx
@@ -1858,7 +1858,48 @@
         <w:rPr>
           <w:rFonts w:hint="eastAsia"/>
         </w:rPr>
-        <w:t xml:space="preserve">。模型先计算供需侧变量，再将价格分解为基准价格、供需缺口压力、风险溢价、恐慌溢价和折价修复项。</w:t>
+        <w:t xml:space="preserve">。模型保留一个统一框架，但分为两层：第一层是题面物理供需层，负责计算供应中断、SPR、库存、绕道运输、需求弹性和恐慌需求共同作用后的</w:t>
+      </w:r>
+      <w:r>
+        <w:t xml:space="preserve"> </w:t>
+      </w:r>
+      <m:oMath>
+        <m:sSub>
+          <m:e>
+            <m:r>
+              <m:t>D</m:t>
+            </m:r>
+          </m:e>
+          <m:sub>
+            <m:r>
+              <m:t>t</m:t>
+            </m:r>
+          </m:sub>
+        </m:sSub>
+        <m:r>
+          <m:rPr>
+            <m:sty m:val="p"/>
+          </m:rPr>
+          <m:t>−</m:t>
+        </m:r>
+        <m:sSub>
+          <m:e>
+            <m:r>
+              <m:t>S</m:t>
+            </m:r>
+          </m:e>
+          <m:sub>
+            <m:r>
+              <m:t>t</m:t>
+            </m:r>
+          </m:sub>
+        </m:sSub>
+      </m:oMath>
+      <w:r>
+        <w:rPr>
+          <w:rFonts w:hint="eastAsia"/>
+        </w:rPr>
+        <w:t xml:space="preserve">；第二层是市场价格形成层，负责刻画期货价格如何吸收物理缺口、地缘风险重估和缓冲机制被确认后的预期修复。</w:t>
       </w:r>
     </w:p>
     <w:p>
@@ -3153,7 +3194,104 @@
         <w:rPr>
           <w:rFonts w:hint="eastAsia"/>
         </w:rPr>
-        <w:t xml:space="preserve">为供需缺口压力系数。地缘风险溢价采用先上升后缓慢衰减的形式：</w:t>
+        <w:t xml:space="preserve">为物理缺口向布伦特期货价格传导的价格形成系数，而不是需求价格弹性本身。题面给出的短期弹性</w:t>
+      </w:r>
+      <w:r>
+        <w:t xml:space="preserve"> </w:t>
+      </w:r>
+      <m:oMath>
+        <m:r>
+          <m:rPr>
+            <m:sty m:val="p"/>
+          </m:rPr>
+          <m:t>−</m:t>
+        </m:r>
+        <m:r>
+          <m:t>0.05</m:t>
+        </m:r>
+      </m:oMath>
+      <w:r>
+        <w:t xml:space="preserve"> </w:t>
+      </w:r>
+      <w:r>
+        <w:rPr>
+          <w:rFonts w:hint="eastAsia"/>
+        </w:rPr>
+        <w:t xml:space="preserve">仍用于需求对价格变化的响应，即上文</w:t>
+      </w:r>
+      <w:r>
+        <w:t xml:space="preserve"> </w:t>
+      </w:r>
+      <m:oMath>
+        <m:sSub>
+          <m:e>
+            <m:r>
+              <m:t>D</m:t>
+            </m:r>
+          </m:e>
+          <m:sub>
+            <m:r>
+              <m:t>t</m:t>
+            </m:r>
+          </m:sub>
+        </m:sSub>
+      </m:oMath>
+      <w:r>
+        <w:t xml:space="preserve"> </w:t>
+      </w:r>
+      <w:r>
+        <w:rPr>
+          <w:rFonts w:hint="eastAsia"/>
+        </w:rPr>
+        <w:t xml:space="preserve">中的</w:t>
+      </w:r>
+      <w:r>
+        <w:t xml:space="preserve"> </w:t>
+      </w:r>
+      <m:oMath>
+        <m:sSub>
+          <m:e>
+            <m:r>
+              <m:t>ε</m:t>
+            </m:r>
+          </m:e>
+          <m:sub>
+            <m:r>
+              <m:t>t</m:t>
+            </m:r>
+          </m:sub>
+        </m:sSub>
+      </m:oMath>
+      <w:r>
+        <w:rPr>
+          <w:rFonts w:hint="eastAsia"/>
+        </w:rPr>
+        <w:t xml:space="preserve">；</w:t>
+      </w:r>
+      <m:oMath>
+        <m:r>
+          <m:t>α</m:t>
+        </m:r>
+      </m:oMath>
+      <w:r>
+        <w:t xml:space="preserve"> </w:t>
+      </w:r>
+      <w:r>
+        <w:rPr>
+          <w:rFonts w:hint="eastAsia"/>
+        </w:rPr>
+        <w:t xml:space="preserve">则刻画剩余供需缺口进入期货目标价格时的传导效率。这样处理的原因是，布伦特期货价格并非对当日物理缺口作一比一机械跳变，而会同时吸收库存、SPR、绕道运输和交易者对政策缓冲可持续性的预期。</w:t>
+      </w:r>
+    </w:p>
+    <w:p>
+      <w:pPr>
+        <w:pStyle w:val="BodyText"/>
+      </w:pPr>
+      <w:r>
+        <w:rPr>
+          <w:rFonts w:hint="eastAsia"/>
+        </w:rPr>
+        <w:t xml:space="preserve">地缘风险溢价采用先上升后缓慢衰减的形式：</w:t>
       </w:r>
     </w:p>
     <w:p>
@@ -3465,7 +3603,7 @@
         <w:rPr>
           <w:rFonts w:hint="eastAsia"/>
         </w:rPr>
-        <w:t xml:space="preserve">为了刻画市场看到缓冲机制生效后的再定价过程，本文加入两类折价项。第一类为缓冲确认折价：</w:t>
+        <w:t xml:space="preserve">为了刻画市场看到缓冲机制生效后的再定价过程，本文加入两类市场价格形成项。第一类为缓冲确认折价：</w:t>
       </w:r>
     </w:p>
     <w:p>
@@ -4034,6 +4172,70 @@
     <w:p>
       <w:pPr>
         <w:pStyle w:val="FirstParagraph"/>
+      </w:pPr>
+      <w:r>
+        <w:rPr>
+          <w:rFonts w:hint="eastAsia"/>
+        </w:rPr>
+        <w:t xml:space="preserve">上述两类折价并不改变</w:t>
+      </w:r>
+      <w:r>
+        <w:t xml:space="preserve"> </w:t>
+      </w:r>
+      <m:oMath>
+        <m:sSub>
+          <m:e>
+            <m:r>
+              <m:t>D</m:t>
+            </m:r>
+          </m:e>
+          <m:sub>
+            <m:r>
+              <m:t>t</m:t>
+            </m:r>
+          </m:sub>
+        </m:sSub>
+        <m:r>
+          <m:rPr>
+            <m:sty m:val="p"/>
+          </m:rPr>
+          <m:t>−</m:t>
+        </m:r>
+        <m:sSub>
+          <m:e>
+            <m:r>
+              <m:t>S</m:t>
+            </m:r>
+          </m:e>
+          <m:sub>
+            <m:r>
+              <m:t>t</m:t>
+            </m:r>
+          </m:sub>
+        </m:sSub>
+      </m:oMath>
+      <w:r>
+        <w:t xml:space="preserve"> </w:t>
+      </w:r>
+      <w:r>
+        <w:rPr>
+          <w:rFonts w:hint="eastAsia"/>
+        </w:rPr>
+        <w:t xml:space="preserve">的物理计算，而是进入目标价格形成层。其经济含义是：当市场观察到</w:t>
+      </w:r>
+      <w:r>
+        <w:t xml:space="preserve"> </w:t>
+      </w:r>
+      <w:r>
+        <w:rPr>
+          <w:rFonts w:hint="eastAsia"/>
+        </w:rPr>
+        <w:t xml:space="preserve">SPR、商业库存和绕道运输逐步发挥作用后，交易者会下调对未来极端短缺持续性的定价。为了避免这些扩展项被误解为任意曲线拟合，本文在结果部分进一步进行机制消融实验，逐项关闭题面物理机制和市场价格形成机制，检验各项机制对误差结构的贡献。</w:t>
+      </w:r>
+    </w:p>
+    <w:p>
+      <w:pPr>
+        <w:pStyle w:val="BodyText"/>
       </w:pPr>
       <w:r>
         <w:rPr>
@@ -5505,7 +5707,7 @@
     </w:tbl>
     <w:bookmarkEnd w:id="25"/>
     <w:bookmarkEnd w:id="26"/>
-    <w:bookmarkStart w:id="64" w:name="结果分析"/>
+    <w:bookmarkStart w:id="68" w:name="结果分析"/>
     <w:p>
       <w:pPr>
         <w:pStyle w:val="Heading1"/>
@@ -6379,7 +6581,7 @@
       </w:r>
     </w:p>
     <w:bookmarkEnd w:id="38"/>
-    <w:bookmarkStart w:id="42" w:name="候选模型比较"/>
+    <w:bookmarkStart w:id="42" w:name="机制消融实验"/>
     <w:p>
       <w:pPr>
         <w:pStyle w:val="Heading2"/>
@@ -6388,7 +6590,7 @@
         <w:rPr>
           <w:rFonts w:hint="eastAsia"/>
         </w:rPr>
-        <w:t xml:space="preserve">候选模型比较</w:t>
+        <w:t xml:space="preserve">机制消融实验</w:t>
       </w:r>
     </w:p>
     <w:p>
@@ -6399,16 +6601,7 @@
         <w:rPr>
           <w:rFonts w:hint="eastAsia"/>
         </w:rPr>
-        <w:t xml:space="preserve">为了避免结论依赖单一参数组合，阶段</w:t>
-      </w:r>
-      <w:r>
-        <w:t xml:space="preserve"> 4 </w:t>
-      </w:r>
-      <w:r>
-        <w:rPr>
-          <w:rFonts w:hint="eastAsia"/>
-        </w:rPr>
-        <w:t xml:space="preserve">保留了综合最优、RMSE</w:t>
+        <w:t xml:space="preserve">为了验证扩展项不是任意加入的曲线拟合补丁，本文在同一个短期模型中逐项关闭关键机制，并保持其余参数不重新校准。消融实验分为两类：题面物理层机制，包括</w:t>
       </w:r>
       <w:r>
         <w:t xml:space="preserve"> </w:t>
@@ -6417,18 +6610,771 @@
         <w:rPr>
           <w:rFonts w:hint="eastAsia"/>
         </w:rPr>
-        <w:t xml:space="preserve">最优、平台解释最优等候选模型。局部稳健性复核模型同时成为综合最优与</w:t>
-      </w:r>
-      <w:r>
-        <w:t xml:space="preserve"> RMSE </w:t>
-      </w:r>
-      <w:r>
-        <w:rPr>
-          <w:rFonts w:hint="eastAsia"/>
-        </w:rPr>
-        <w:t xml:space="preserve">最优；平台解释最优模型虽然对高价平台刻画更强，但整体误差和低价回落误差较高，因此不作为主模型。</w:t>
-      </w:r>
-    </w:p>
+        <w:t xml:space="preserve">SPR、商业库存、绕道运输、需求收缩和恐慌溢价；市场价格形成层机制，包括地缘风险与不确定性溢价、缓冲确认折价和预期修复折价。若关闭某一机制后误差结构显著恶化，说明该机制对解释价格路径具有边际贡献。</w:t>
+      </w:r>
+    </w:p>
+    <w:p>
+      <w:pPr>
+        <w:pStyle w:val="TableCaption"/>
+      </w:pPr>
+      <w:r>
+        <w:rPr>
+          <w:rFonts w:hint="eastAsia"/>
+        </w:rPr>
+        <w:t xml:space="preserve">短期模型机制消融实验</w:t>
+      </w:r>
+    </w:p>
+    <w:tbl>
+      <w:tblPr>
+        <w:tblStyle w:val="Table"/>
+        <w:tblW w:type="auto" w:w="0"/>
+        <w:tblLook w:firstRow="1" w:lastRow="0" w:firstColumn="0" w:lastColumn="0" w:noHBand="0" w:noVBand="0" w:val="0020"/>
+        <w:tblCaption w:val="短期模型机制消融实验"/>
+      </w:tblPr>
+      <w:tblGrid>
+        <w:gridCol w:w="1584"/>
+        <w:gridCol w:w="1584"/>
+        <w:gridCol w:w="1584"/>
+        <w:gridCol w:w="1584"/>
+        <w:gridCol w:w="1584"/>
+      </w:tblGrid>
+      <w:tr>
+        <w:trPr>
+          <w:tblHeader w:val="on"/>
+        </w:trPr>
+        <w:tc>
+          <w:tcPr/>
+          <w:p>
+            <w:pPr>
+              <w:pStyle w:val="Compact"/>
+              <w:jc w:val="left"/>
+            </w:pPr>
+            <w:r>
+              <w:rPr>
+                <w:rFonts w:hint="eastAsia"/>
+              </w:rPr>
+              <w:t xml:space="preserve">消融实验</w:t>
+            </w:r>
+          </w:p>
+        </w:tc>
+        <w:tc>
+          <w:tcPr/>
+          <w:p>
+            <w:pPr>
+              <w:pStyle w:val="Compact"/>
+              <w:jc w:val="right"/>
+            </w:pPr>
+            <w:r>
+              <w:t xml:space="preserve">RMSE</w:t>
+            </w:r>
+          </w:p>
+        </w:tc>
+        <w:tc>
+          <w:tcPr/>
+          <w:p>
+            <w:pPr>
+              <w:pStyle w:val="Compact"/>
+              <w:jc w:val="right"/>
+            </w:pPr>
+            <w:r>
+              <w:rPr>
+                <w:rFonts w:hint="eastAsia"/>
+              </w:rPr>
+              <w:t xml:space="preserve">RMSE变化</w:t>
+            </w:r>
+          </w:p>
+        </w:tc>
+        <w:tc>
+          <w:tcPr/>
+          <w:p>
+            <w:pPr>
+              <w:pStyle w:val="Compact"/>
+              <w:jc w:val="right"/>
+            </w:pPr>
+            <w:r>
+              <w:rPr>
+                <w:rFonts w:hint="eastAsia"/>
+              </w:rPr>
+              <w:t xml:space="preserve">后期RMSE</w:t>
+            </w:r>
+          </w:p>
+        </w:tc>
+        <w:tc>
+          <w:tcPr/>
+          <w:p>
+            <w:pPr>
+              <w:pStyle w:val="Compact"/>
+              <w:jc w:val="right"/>
+            </w:pPr>
+            <w:r>
+              <w:rPr>
+                <w:rFonts w:hint="eastAsia"/>
+              </w:rPr>
+              <w:t xml:space="preserve">低价回落RMSE</w:t>
+            </w:r>
+          </w:p>
+        </w:tc>
+      </w:tr>
+      <w:tr>
+        <w:tc>
+          <w:tcPr/>
+          <w:p>
+            <w:pPr>
+              <w:pStyle w:val="Compact"/>
+              <w:jc w:val="left"/>
+            </w:pPr>
+            <w:r>
+              <w:rPr>
+                <w:rFonts w:hint="eastAsia"/>
+              </w:rPr>
+              <w:t xml:space="preserve">完整统一模型</w:t>
+            </w:r>
+          </w:p>
+        </w:tc>
+        <w:tc>
+          <w:tcPr/>
+          <w:p>
+            <w:pPr>
+              <w:pStyle w:val="Compact"/>
+              <w:jc w:val="right"/>
+            </w:pPr>
+            <w:r>
+              <w:t xml:space="preserve">3.47</w:t>
+            </w:r>
+          </w:p>
+        </w:tc>
+        <w:tc>
+          <w:tcPr/>
+          <w:p>
+            <w:pPr>
+              <w:pStyle w:val="Compact"/>
+              <w:jc w:val="right"/>
+            </w:pPr>
+            <w:r>
+              <w:t xml:space="preserve">0.00</w:t>
+            </w:r>
+          </w:p>
+        </w:tc>
+        <w:tc>
+          <w:tcPr/>
+          <w:p>
+            <w:pPr>
+              <w:pStyle w:val="Compact"/>
+              <w:jc w:val="right"/>
+            </w:pPr>
+            <w:r>
+              <w:t xml:space="preserve">2.84</w:t>
+            </w:r>
+          </w:p>
+        </w:tc>
+        <w:tc>
+          <w:tcPr/>
+          <w:p>
+            <w:pPr>
+              <w:pStyle w:val="Compact"/>
+              <w:jc w:val="right"/>
+            </w:pPr>
+            <w:r>
+              <w:t xml:space="preserve">3.48</w:t>
+            </w:r>
+          </w:p>
+        </w:tc>
+      </w:tr>
+      <w:tr>
+        <w:tc>
+          <w:tcPr/>
+          <w:p>
+            <w:pPr>
+              <w:pStyle w:val="Compact"/>
+              <w:jc w:val="left"/>
+            </w:pPr>
+            <w:r>
+              <w:rPr>
+                <w:rFonts w:hint="eastAsia"/>
+              </w:rPr>
+              <w:t xml:space="preserve">去除</w:t>
+            </w:r>
+            <w:r>
+              <w:t xml:space="preserve"> SPR </w:t>
+            </w:r>
+            <w:r>
+              <w:rPr>
+                <w:rFonts w:hint="eastAsia"/>
+              </w:rPr>
+              <w:t xml:space="preserve">释放</w:t>
+            </w:r>
+          </w:p>
+        </w:tc>
+        <w:tc>
+          <w:tcPr/>
+          <w:p>
+            <w:pPr>
+              <w:pStyle w:val="Compact"/>
+              <w:jc w:val="right"/>
+            </w:pPr>
+            <w:r>
+              <w:t xml:space="preserve">5.55</w:t>
+            </w:r>
+          </w:p>
+        </w:tc>
+        <w:tc>
+          <w:tcPr/>
+          <w:p>
+            <w:pPr>
+              <w:pStyle w:val="Compact"/>
+              <w:jc w:val="right"/>
+            </w:pPr>
+            <w:r>
+              <w:t xml:space="preserve">+2.08</w:t>
+            </w:r>
+          </w:p>
+        </w:tc>
+        <w:tc>
+          <w:tcPr/>
+          <w:p>
+            <w:pPr>
+              <w:pStyle w:val="Compact"/>
+              <w:jc w:val="right"/>
+            </w:pPr>
+            <w:r>
+              <w:t xml:space="preserve">5.37</w:t>
+            </w:r>
+          </w:p>
+        </w:tc>
+        <w:tc>
+          <w:tcPr/>
+          <w:p>
+            <w:pPr>
+              <w:pStyle w:val="Compact"/>
+              <w:jc w:val="right"/>
+            </w:pPr>
+            <w:r>
+              <w:t xml:space="preserve">6.13</w:t>
+            </w:r>
+          </w:p>
+        </w:tc>
+      </w:tr>
+      <w:tr>
+        <w:tc>
+          <w:tcPr/>
+          <w:p>
+            <w:pPr>
+              <w:pStyle w:val="Compact"/>
+              <w:jc w:val="left"/>
+            </w:pPr>
+            <w:r>
+              <w:rPr>
+                <w:rFonts w:hint="eastAsia"/>
+              </w:rPr>
+              <w:t xml:space="preserve">去除商业库存缓冲</w:t>
+            </w:r>
+          </w:p>
+        </w:tc>
+        <w:tc>
+          <w:tcPr/>
+          <w:p>
+            <w:pPr>
+              <w:pStyle w:val="Compact"/>
+              <w:jc w:val="right"/>
+            </w:pPr>
+            <w:r>
+              <w:t xml:space="preserve">3.50</w:t>
+            </w:r>
+          </w:p>
+        </w:tc>
+        <w:tc>
+          <w:tcPr/>
+          <w:p>
+            <w:pPr>
+              <w:pStyle w:val="Compact"/>
+              <w:jc w:val="right"/>
+            </w:pPr>
+            <w:r>
+              <w:t xml:space="preserve">+0.03</w:t>
+            </w:r>
+          </w:p>
+        </w:tc>
+        <w:tc>
+          <w:tcPr/>
+          <w:p>
+            <w:pPr>
+              <w:pStyle w:val="Compact"/>
+              <w:jc w:val="right"/>
+            </w:pPr>
+            <w:r>
+              <w:t xml:space="preserve">2.79</w:t>
+            </w:r>
+          </w:p>
+        </w:tc>
+        <w:tc>
+          <w:tcPr/>
+          <w:p>
+            <w:pPr>
+              <w:pStyle w:val="Compact"/>
+              <w:jc w:val="right"/>
+            </w:pPr>
+            <w:r>
+              <w:t xml:space="preserve">3.67</w:t>
+            </w:r>
+          </w:p>
+        </w:tc>
+      </w:tr>
+      <w:tr>
+        <w:tc>
+          <w:tcPr/>
+          <w:p>
+            <w:pPr>
+              <w:pStyle w:val="Compact"/>
+              <w:jc w:val="left"/>
+            </w:pPr>
+            <w:r>
+              <w:rPr>
+                <w:rFonts w:hint="eastAsia"/>
+              </w:rPr>
+              <w:t xml:space="preserve">去除绕道运输</w:t>
+            </w:r>
+          </w:p>
+        </w:tc>
+        <w:tc>
+          <w:tcPr/>
+          <w:p>
+            <w:pPr>
+              <w:pStyle w:val="Compact"/>
+              <w:jc w:val="right"/>
+            </w:pPr>
+            <w:r>
+              <w:t xml:space="preserve">3.48</w:t>
+            </w:r>
+          </w:p>
+        </w:tc>
+        <w:tc>
+          <w:tcPr/>
+          <w:p>
+            <w:pPr>
+              <w:pStyle w:val="Compact"/>
+              <w:jc w:val="right"/>
+            </w:pPr>
+            <w:r>
+              <w:t xml:space="preserve">+0.01</w:t>
+            </w:r>
+          </w:p>
+        </w:tc>
+        <w:tc>
+          <w:tcPr/>
+          <w:p>
+            <w:pPr>
+              <w:pStyle w:val="Compact"/>
+              <w:jc w:val="right"/>
+            </w:pPr>
+            <w:r>
+              <w:t xml:space="preserve">2.79</w:t>
+            </w:r>
+          </w:p>
+        </w:tc>
+        <w:tc>
+          <w:tcPr/>
+          <w:p>
+            <w:pPr>
+              <w:pStyle w:val="Compact"/>
+              <w:jc w:val="right"/>
+            </w:pPr>
+            <w:r>
+              <w:t xml:space="preserve">3.56</w:t>
+            </w:r>
+          </w:p>
+        </w:tc>
+      </w:tr>
+      <w:tr>
+        <w:tc>
+          <w:tcPr/>
+          <w:p>
+            <w:pPr>
+              <w:pStyle w:val="Compact"/>
+              <w:jc w:val="left"/>
+            </w:pPr>
+            <w:r>
+              <w:rPr>
+                <w:rFonts w:hint="eastAsia"/>
+              </w:rPr>
+              <w:t xml:space="preserve">去除需求收缩</w:t>
+            </w:r>
+          </w:p>
+        </w:tc>
+        <w:tc>
+          <w:tcPr/>
+          <w:p>
+            <w:pPr>
+              <w:pStyle w:val="Compact"/>
+              <w:jc w:val="right"/>
+            </w:pPr>
+            <w:r>
+              <w:t xml:space="preserve">4.58</w:t>
+            </w:r>
+          </w:p>
+        </w:tc>
+        <w:tc>
+          <w:tcPr/>
+          <w:p>
+            <w:pPr>
+              <w:pStyle w:val="Compact"/>
+              <w:jc w:val="right"/>
+            </w:pPr>
+            <w:r>
+              <w:t xml:space="preserve">+1.11</w:t>
+            </w:r>
+          </w:p>
+        </w:tc>
+        <w:tc>
+          <w:tcPr/>
+          <w:p>
+            <w:pPr>
+              <w:pStyle w:val="Compact"/>
+              <w:jc w:val="right"/>
+            </w:pPr>
+            <w:r>
+              <w:t xml:space="preserve">2.61</w:t>
+            </w:r>
+          </w:p>
+        </w:tc>
+        <w:tc>
+          <w:tcPr/>
+          <w:p>
+            <w:pPr>
+              <w:pStyle w:val="Compact"/>
+              <w:jc w:val="right"/>
+            </w:pPr>
+            <w:r>
+              <w:t xml:space="preserve">5.07</w:t>
+            </w:r>
+          </w:p>
+        </w:tc>
+      </w:tr>
+      <w:tr>
+        <w:tc>
+          <w:tcPr/>
+          <w:p>
+            <w:pPr>
+              <w:pStyle w:val="Compact"/>
+              <w:jc w:val="left"/>
+            </w:pPr>
+            <w:r>
+              <w:rPr>
+                <w:rFonts w:hint="eastAsia"/>
+              </w:rPr>
+              <w:t xml:space="preserve">去除恐慌溢价</w:t>
+            </w:r>
+          </w:p>
+        </w:tc>
+        <w:tc>
+          <w:tcPr/>
+          <w:p>
+            <w:pPr>
+              <w:pStyle w:val="Compact"/>
+              <w:jc w:val="right"/>
+            </w:pPr>
+            <w:r>
+              <w:t xml:space="preserve">3.64</w:t>
+            </w:r>
+          </w:p>
+        </w:tc>
+        <w:tc>
+          <w:tcPr/>
+          <w:p>
+            <w:pPr>
+              <w:pStyle w:val="Compact"/>
+              <w:jc w:val="right"/>
+            </w:pPr>
+            <w:r>
+              <w:t xml:space="preserve">+0.17</w:t>
+            </w:r>
+          </w:p>
+        </w:tc>
+        <w:tc>
+          <w:tcPr/>
+          <w:p>
+            <w:pPr>
+              <w:pStyle w:val="Compact"/>
+              <w:jc w:val="right"/>
+            </w:pPr>
+            <w:r>
+              <w:t xml:space="preserve">2.82</w:t>
+            </w:r>
+          </w:p>
+        </w:tc>
+        <w:tc>
+          <w:tcPr/>
+          <w:p>
+            <w:pPr>
+              <w:pStyle w:val="Compact"/>
+              <w:jc w:val="right"/>
+            </w:pPr>
+            <w:r>
+              <w:t xml:space="preserve">3.48</w:t>
+            </w:r>
+          </w:p>
+        </w:tc>
+      </w:tr>
+      <w:tr>
+        <w:tc>
+          <w:tcPr/>
+          <w:p>
+            <w:pPr>
+              <w:pStyle w:val="Compact"/>
+              <w:jc w:val="left"/>
+            </w:pPr>
+            <w:r>
+              <w:rPr>
+                <w:rFonts w:hint="eastAsia"/>
+              </w:rPr>
+              <w:t xml:space="preserve">去除风险与不确定性溢价</w:t>
+            </w:r>
+          </w:p>
+        </w:tc>
+        <w:tc>
+          <w:tcPr/>
+          <w:p>
+            <w:pPr>
+              <w:pStyle w:val="Compact"/>
+              <w:jc w:val="right"/>
+            </w:pPr>
+            <w:r>
+              <w:t xml:space="preserve">30.79</w:t>
+            </w:r>
+          </w:p>
+        </w:tc>
+        <w:tc>
+          <w:tcPr/>
+          <w:p>
+            <w:pPr>
+              <w:pStyle w:val="Compact"/>
+              <w:jc w:val="right"/>
+            </w:pPr>
+            <w:r>
+              <w:t xml:space="preserve">+27.32</w:t>
+            </w:r>
+          </w:p>
+        </w:tc>
+        <w:tc>
+          <w:tcPr/>
+          <w:p>
+            <w:pPr>
+              <w:pStyle w:val="Compact"/>
+              <w:jc w:val="right"/>
+            </w:pPr>
+            <w:r>
+              <w:t xml:space="preserve">36.17</w:t>
+            </w:r>
+          </w:p>
+        </w:tc>
+        <w:tc>
+          <w:tcPr/>
+          <w:p>
+            <w:pPr>
+              <w:pStyle w:val="Compact"/>
+              <w:jc w:val="right"/>
+            </w:pPr>
+            <w:r>
+              <w:t xml:space="preserve">25.84</w:t>
+            </w:r>
+          </w:p>
+        </w:tc>
+      </w:tr>
+      <w:tr>
+        <w:tc>
+          <w:tcPr/>
+          <w:p>
+            <w:pPr>
+              <w:pStyle w:val="Compact"/>
+              <w:jc w:val="left"/>
+            </w:pPr>
+            <w:r>
+              <w:rPr>
+                <w:rFonts w:hint="eastAsia"/>
+              </w:rPr>
+              <w:t xml:space="preserve">去除缓冲确认折价</w:t>
+            </w:r>
+          </w:p>
+        </w:tc>
+        <w:tc>
+          <w:tcPr/>
+          <w:p>
+            <w:pPr>
+              <w:pStyle w:val="Compact"/>
+              <w:jc w:val="right"/>
+            </w:pPr>
+            <w:r>
+              <w:t xml:space="preserve">4.81</w:t>
+            </w:r>
+          </w:p>
+        </w:tc>
+        <w:tc>
+          <w:tcPr/>
+          <w:p>
+            <w:pPr>
+              <w:pStyle w:val="Compact"/>
+              <w:jc w:val="right"/>
+            </w:pPr>
+            <w:r>
+              <w:t xml:space="preserve">+1.35</w:t>
+            </w:r>
+          </w:p>
+        </w:tc>
+        <w:tc>
+          <w:tcPr/>
+          <w:p>
+            <w:pPr>
+              <w:pStyle w:val="Compact"/>
+              <w:jc w:val="right"/>
+            </w:pPr>
+            <w:r>
+              <w:t xml:space="preserve">3.92</w:t>
+            </w:r>
+          </w:p>
+        </w:tc>
+        <w:tc>
+          <w:tcPr/>
+          <w:p>
+            <w:pPr>
+              <w:pStyle w:val="Compact"/>
+              <w:jc w:val="right"/>
+            </w:pPr>
+            <w:r>
+              <w:t xml:space="preserve">5.86</w:t>
+            </w:r>
+          </w:p>
+        </w:tc>
+      </w:tr>
+      <w:tr>
+        <w:tc>
+          <w:tcPr/>
+          <w:p>
+            <w:pPr>
+              <w:pStyle w:val="Compact"/>
+              <w:jc w:val="left"/>
+            </w:pPr>
+            <w:r>
+              <w:rPr>
+                <w:rFonts w:hint="eastAsia"/>
+              </w:rPr>
+              <w:t xml:space="preserve">去除预期修复折价</w:t>
+            </w:r>
+          </w:p>
+        </w:tc>
+        <w:tc>
+          <w:tcPr/>
+          <w:p>
+            <w:pPr>
+              <w:pStyle w:val="Compact"/>
+              <w:jc w:val="right"/>
+            </w:pPr>
+            <w:r>
+              <w:t xml:space="preserve">7.48</w:t>
+            </w:r>
+          </w:p>
+        </w:tc>
+        <w:tc>
+          <w:tcPr/>
+          <w:p>
+            <w:pPr>
+              <w:pStyle w:val="Compact"/>
+              <w:jc w:val="right"/>
+            </w:pPr>
+            <w:r>
+              <w:t xml:space="preserve">+4.01</w:t>
+            </w:r>
+          </w:p>
+        </w:tc>
+        <w:tc>
+          <w:tcPr/>
+          <w:p>
+            <w:pPr>
+              <w:pStyle w:val="Compact"/>
+              <w:jc w:val="right"/>
+            </w:pPr>
+            <w:r>
+              <w:t xml:space="preserve">10.36</w:t>
+            </w:r>
+          </w:p>
+        </w:tc>
+        <w:tc>
+          <w:tcPr/>
+          <w:p>
+            <w:pPr>
+              <w:pStyle w:val="Compact"/>
+              <w:jc w:val="right"/>
+            </w:pPr>
+            <w:r>
+              <w:t xml:space="preserve">10.05</w:t>
+            </w:r>
+          </w:p>
+        </w:tc>
+      </w:tr>
+      <w:tr>
+        <w:tc>
+          <w:tcPr/>
+          <w:p>
+            <w:pPr>
+              <w:pStyle w:val="Compact"/>
+              <w:jc w:val="left"/>
+            </w:pPr>
+            <w:r>
+              <w:rPr>
+                <w:rFonts w:hint="eastAsia"/>
+              </w:rPr>
+              <w:t xml:space="preserve">去除全部市场修正</w:t>
+            </w:r>
+          </w:p>
+        </w:tc>
+        <w:tc>
+          <w:tcPr/>
+          <w:p>
+            <w:pPr>
+              <w:pStyle w:val="Compact"/>
+              <w:jc w:val="right"/>
+            </w:pPr>
+            <w:r>
+              <w:t xml:space="preserve">26.94</w:t>
+            </w:r>
+          </w:p>
+        </w:tc>
+        <w:tc>
+          <w:tcPr/>
+          <w:p>
+            <w:pPr>
+              <w:pStyle w:val="Compact"/>
+              <w:jc w:val="right"/>
+            </w:pPr>
+            <w:r>
+              <w:t xml:space="preserve">+23.48</w:t>
+            </w:r>
+          </w:p>
+        </w:tc>
+        <w:tc>
+          <w:tcPr/>
+          <w:p>
+            <w:pPr>
+              <w:pStyle w:val="Compact"/>
+              <w:jc w:val="right"/>
+            </w:pPr>
+            <w:r>
+              <w:t xml:space="preserve">29.33</w:t>
+            </w:r>
+          </w:p>
+        </w:tc>
+        <w:tc>
+          <w:tcPr/>
+          <w:p>
+            <w:pPr>
+              <w:pStyle w:val="Compact"/>
+              <w:jc w:val="right"/>
+            </w:pPr>
+            <w:r>
+              <w:t xml:space="preserve">18.83</w:t>
+            </w:r>
+          </w:p>
+        </w:tc>
+      </w:tr>
+    </w:tbl>
     <w:p>
       <w:pPr>
         <w:pStyle w:val="CaptionedFigure"/>
@@ -6436,20 +7382,277 @@
       <w:r>
         <w:drawing>
           <wp:inline>
-            <wp:extent cx="4907280" cy="2587474"/>
+            <wp:extent cx="5067300" cy="2618105"/>
             <wp:effectExtent b="0" l="0" r="0" t="0"/>
             <wp:docPr descr="" title="" id="40" name="Picture"/>
             <a:graphic>
               <a:graphicData uri="http://schemas.openxmlformats.org/drawingml/2006/picture">
                 <pic:pic>
                   <pic:nvPicPr>
-                    <pic:cNvPr descr="候选模型误差对比.png" id="41" name="Picture"/>
+                    <pic:cNvPr descr="短期模型机制消融实验.png" id="41" name="Picture"/>
                     <pic:cNvPicPr>
                       <a:picLocks noChangeArrowheads="1" noChangeAspect="1"/>
                     </pic:cNvPicPr>
                   </pic:nvPicPr>
                   <pic:blipFill>
                     <a:blip r:embed="rId39"/>
+                    <a:stretch>
+                      <a:fillRect/>
+                    </a:stretch>
+                  </pic:blipFill>
+                  <pic:spPr bwMode="auto">
+                    <a:xfrm>
+                      <a:off x="0" y="0"/>
+                      <a:ext cx="5067300" cy="2618105"/>
+                    </a:xfrm>
+                    <a:prstGeom prst="rect">
+                      <a:avLst/>
+                    </a:prstGeom>
+                    <a:noFill/>
+                    <a:ln w="9525">
+                      <a:noFill/>
+                      <a:headEnd/>
+                      <a:tailEnd/>
+                    </a:ln>
+                  </pic:spPr>
+                </pic:pic>
+              </a:graphicData>
+            </a:graphic>
+          </wp:inline>
+        </w:drawing>
+      </w:r>
+    </w:p>
+    <w:p>
+      <w:pPr>
+        <w:pStyle w:val="ImageCaption"/>
+      </w:pPr>
+      <w:r>
+        <w:rPr>
+          <w:rFonts w:hint="eastAsia"/>
+        </w:rPr>
+        <w:t xml:space="preserve">短期模型机制消融实验。图中展示关闭不同机制后全窗口</w:t>
+      </w:r>
+      <w:r>
+        <w:t xml:space="preserve"> RMSE </w:t>
+      </w:r>
+      <w:r>
+        <w:rPr>
+          <w:rFonts w:hint="eastAsia"/>
+        </w:rPr>
+        <w:t xml:space="preserve">和后期</w:t>
+      </w:r>
+      <w:r>
+        <w:t xml:space="preserve"> RMSE </w:t>
+      </w:r>
+      <w:r>
+        <w:rPr>
+          <w:rFonts w:hint="eastAsia"/>
+        </w:rPr>
+        <w:t xml:space="preserve">相对完整模型的变化。</w:t>
+      </w:r>
+    </w:p>
+    <w:p>
+      <w:pPr>
+        <w:pStyle w:val="BodyText"/>
+      </w:pPr>
+      <w:r>
+        <w:rPr>
+          <w:rFonts w:hint="eastAsia"/>
+        </w:rPr>
+        <w:t xml:space="preserve">消融结果说明，SPR</w:t>
+      </w:r>
+      <w:r>
+        <w:t xml:space="preserve"> </w:t>
+      </w:r>
+      <w:r>
+        <w:rPr>
+          <w:rFonts w:hint="eastAsia"/>
+        </w:rPr>
+        <w:t xml:space="preserve">释放、需求收缩、恐慌溢价、风险与不确定性溢价、缓冲确认折价和预期修复折价均对误差结构有可见贡献。其中，去除</w:t>
+      </w:r>
+      <w:r>
+        <w:t xml:space="preserve"> SPR </w:t>
+      </w:r>
+      <w:r>
+        <w:rPr>
+          <w:rFonts w:hint="eastAsia"/>
+        </w:rPr>
+        <w:t xml:space="preserve">后</w:t>
+      </w:r>
+      <w:r>
+        <w:t xml:space="preserve"> RMSE </w:t>
+      </w:r>
+      <w:r>
+        <w:rPr>
+          <w:rFonts w:hint="eastAsia"/>
+        </w:rPr>
+        <w:t xml:space="preserve">从</w:t>
+      </w:r>
+      <w:r>
+        <w:t xml:space="preserve"> 3.47 </w:t>
+      </w:r>
+      <w:r>
+        <w:rPr>
+          <w:rFonts w:hint="eastAsia"/>
+        </w:rPr>
+        <w:t xml:space="preserve">升至</w:t>
+      </w:r>
+      <w:r>
+        <w:t xml:space="preserve"> </w:t>
+      </w:r>
+      <w:r>
+        <w:rPr>
+          <w:rFonts w:hint="eastAsia"/>
+        </w:rPr>
+        <w:t xml:space="preserve">5.55，说明题面政策缓冲机制并非装饰项；去除需求收缩后低价回落</w:t>
+      </w:r>
+      <w:r>
+        <w:t xml:space="preserve"> RMSE </w:t>
+      </w:r>
+      <w:r>
+        <w:rPr>
+          <w:rFonts w:hint="eastAsia"/>
+        </w:rPr>
+        <w:t xml:space="preserve">升至</w:t>
+      </w:r>
+      <w:r>
+        <w:t xml:space="preserve"> </w:t>
+      </w:r>
+      <w:r>
+        <w:rPr>
+          <w:rFonts w:hint="eastAsia"/>
+        </w:rPr>
+        <w:t xml:space="preserve">5.07，说明需求侧调整对解释后期回落有作用。商业库存和绕道运输在当前</w:t>
+      </w:r>
+      <w:r>
+        <w:t xml:space="preserve"> 46 </w:t>
+      </w:r>
+      <w:r>
+        <w:rPr>
+          <w:rFonts w:hint="eastAsia"/>
+        </w:rPr>
+        <w:t xml:space="preserve">个交易日窗口内的边际影响较小，这表明它们更适合在</w:t>
+      </w:r>
+      <w:r>
+        <w:t xml:space="preserve"> 60–180 </w:t>
+      </w:r>
+      <w:r>
+        <w:rPr>
+          <w:rFonts w:hint="eastAsia"/>
+        </w:rPr>
+        <w:t xml:space="preserve">天情景预测中发挥作用，而非在短窗口拟合中承担主要解释责任。</w:t>
+      </w:r>
+    </w:p>
+    <w:p>
+      <w:pPr>
+        <w:pStyle w:val="BodyText"/>
+      </w:pPr>
+      <w:r>
+        <w:rPr>
+          <w:rFonts w:hint="eastAsia"/>
+        </w:rPr>
+        <w:t xml:space="preserve">市场价格形成层的贡献主要体现在风险重估和后期再定价。若关闭风险与不确定性溢价，模型无法解释冲突后油价快速进入高位区间；若关闭预期修复折价，后期</w:t>
+      </w:r>
+      <w:r>
+        <w:t xml:space="preserve"> RMSE </w:t>
+      </w:r>
+      <w:r>
+        <w:rPr>
+          <w:rFonts w:hint="eastAsia"/>
+        </w:rPr>
+        <w:t xml:space="preserve">从</w:t>
+      </w:r>
+      <w:r>
+        <w:t xml:space="preserve"> 2.84 </w:t>
+      </w:r>
+      <w:r>
+        <w:rPr>
+          <w:rFonts w:hint="eastAsia"/>
+        </w:rPr>
+        <w:t xml:space="preserve">升至</w:t>
+      </w:r>
+      <w:r>
+        <w:t xml:space="preserve"> </w:t>
+      </w:r>
+      <w:r>
+        <w:rPr>
+          <w:rFonts w:hint="eastAsia"/>
+        </w:rPr>
+        <w:t xml:space="preserve">10.36，说明该项主要负责解释缓冲机制被市场确认后的阶段性回落。由此，完整模型不是把题面机制替换掉，而是在题面物理供需层之上加入期货价格形成层：物理机制决定缺口与缓冲底座，市场价格形成机制决定价格如何消化这些信息。</w:t>
+      </w:r>
+    </w:p>
+    <w:bookmarkEnd w:id="42"/>
+    <w:bookmarkStart w:id="46" w:name="候选模型比较"/>
+    <w:p>
+      <w:pPr>
+        <w:pStyle w:val="Heading2"/>
+      </w:pPr>
+      <w:r>
+        <w:rPr>
+          <w:rFonts w:hint="eastAsia"/>
+        </w:rPr>
+        <w:t xml:space="preserve">候选模型比较</w:t>
+      </w:r>
+    </w:p>
+    <w:p>
+      <w:pPr>
+        <w:pStyle w:val="FirstParagraph"/>
+      </w:pPr>
+      <w:r>
+        <w:rPr>
+          <w:rFonts w:hint="eastAsia"/>
+        </w:rPr>
+        <w:t xml:space="preserve">为了避免结论依赖单一参数组合，阶段</w:t>
+      </w:r>
+      <w:r>
+        <w:t xml:space="preserve"> 4 </w:t>
+      </w:r>
+      <w:r>
+        <w:rPr>
+          <w:rFonts w:hint="eastAsia"/>
+        </w:rPr>
+        <w:t xml:space="preserve">保留了综合最优、RMSE</w:t>
+      </w:r>
+      <w:r>
+        <w:t xml:space="preserve"> </w:t>
+      </w:r>
+      <w:r>
+        <w:rPr>
+          <w:rFonts w:hint="eastAsia"/>
+        </w:rPr>
+        <w:t xml:space="preserve">最优、平台解释最优等候选模型。局部稳健性复核模型同时成为综合最优与</w:t>
+      </w:r>
+      <w:r>
+        <w:t xml:space="preserve"> RMSE </w:t>
+      </w:r>
+      <w:r>
+        <w:rPr>
+          <w:rFonts w:hint="eastAsia"/>
+        </w:rPr>
+        <w:t xml:space="preserve">最优；平台解释最优模型虽然对高价平台刻画更强，但整体误差和低价回落误差较高，因此不作为主模型。</w:t>
+      </w:r>
+    </w:p>
+    <w:p>
+      <w:pPr>
+        <w:pStyle w:val="CaptionedFigure"/>
+      </w:pPr>
+      <w:r>
+        <w:drawing>
+          <wp:inline>
+            <wp:extent cx="4907280" cy="2587474"/>
+            <wp:effectExtent b="0" l="0" r="0" t="0"/>
+            <wp:docPr descr="" title="" id="44" name="Picture"/>
+            <a:graphic>
+              <a:graphicData uri="http://schemas.openxmlformats.org/drawingml/2006/picture">
+                <pic:pic>
+                  <pic:nvPicPr>
+                    <pic:cNvPr descr="候选模型误差对比.png" id="45" name="Picture"/>
+                    <pic:cNvPicPr>
+                      <a:picLocks noChangeArrowheads="1" noChangeAspect="1"/>
+                    </pic:cNvPicPr>
+                  </pic:nvPicPr>
+                  <pic:blipFill>
+                    <a:blip r:embed="rId43"/>
                     <a:stretch>
                       <a:fillRect/>
                     </a:stretch>
@@ -6487,8 +7690,8 @@
         <w:t xml:space="preserve">代表候选模型误差结构对比。综合最优模型在整体误差、后期误差和低价回落误差之间取得更均衡的表现。</w:t>
       </w:r>
     </w:p>
-    <w:bookmarkEnd w:id="42"/>
-    <w:bookmarkStart w:id="43" w:name="质量检验与稳健性分析"/>
+    <w:bookmarkEnd w:id="46"/>
+    <w:bookmarkStart w:id="47" w:name="质量检验与稳健性分析"/>
     <w:p>
       <w:pPr>
         <w:pStyle w:val="Heading2"/>
@@ -7013,8 +8216,8 @@
         <w:t xml:space="preserve">0.776，说明模型中的供需、风险和缓冲机制提供了价格惯性之外的解释力。</w:t>
       </w:r>
     </w:p>
-    <w:bookmarkEnd w:id="43"/>
-    <w:bookmarkStart w:id="53" w:name="基于基准对比与拐点分析的防御性检验"/>
+    <w:bookmarkEnd w:id="47"/>
+    <w:bookmarkStart w:id="57" w:name="基于基准对比与拐点分析的防御性检验"/>
     <w:p>
       <w:pPr>
         <w:pStyle w:val="Heading2"/>
@@ -7538,18 +8741,18 @@
           <wp:inline>
             <wp:extent cx="4800600" cy="2651760"/>
             <wp:effectExtent b="0" l="0" r="0" t="0"/>
-            <wp:docPr descr="" title="" id="45" name="Picture"/>
+            <wp:docPr descr="" title="" id="49" name="Picture"/>
             <a:graphic>
               <a:graphicData uri="http://schemas.openxmlformats.org/drawingml/2006/picture">
                 <pic:pic>
                   <pic:nvPicPr>
-                    <pic:cNvPr descr="短期模型基准对比.png" id="46" name="Picture"/>
+                    <pic:cNvPr descr="短期模型基准对比.png" id="50" name="Picture"/>
                     <pic:cNvPicPr>
                       <a:picLocks noChangeArrowheads="1" noChangeAspect="1"/>
                     </pic:cNvPicPr>
                   </pic:nvPicPr>
                   <pic:blipFill>
-                    <a:blip r:embed="rId44"/>
+                    <a:blip r:embed="rId48"/>
                     <a:stretch>
                       <a:fillRect/>
                     </a:stretch>
@@ -7791,18 +8994,18 @@
           <wp:inline>
             <wp:extent cx="4587240" cy="2655770"/>
             <wp:effectExtent b="0" l="0" r="0" t="0"/>
-            <wp:docPr descr="" title="" id="48" name="Picture"/>
+            <wp:docPr descr="" title="" id="52" name="Picture"/>
             <a:graphic>
               <a:graphicData uri="http://schemas.openxmlformats.org/drawingml/2006/picture">
                 <pic:pic>
                   <pic:nvPicPr>
-                    <pic:cNvPr descr="短期模型滞后平移检验.png" id="49" name="Picture"/>
+                    <pic:cNvPr descr="短期模型滞后平移检验.png" id="53" name="Picture"/>
                     <pic:cNvPicPr>
                       <a:picLocks noChangeArrowheads="1" noChangeAspect="1"/>
                     </pic:cNvPicPr>
                   </pic:nvPicPr>
                   <pic:blipFill>
-                    <a:blip r:embed="rId47"/>
+                    <a:blip r:embed="rId51"/>
                     <a:stretch>
                       <a:fillRect/>
                     </a:stretch>
@@ -7914,18 +9117,18 @@
           <wp:inline>
             <wp:extent cx="5067300" cy="3685309"/>
             <wp:effectExtent b="0" l="0" r="0" t="0"/>
-            <wp:docPr descr="" title="" id="51" name="Picture"/>
+            <wp:docPr descr="" title="" id="55" name="Picture"/>
             <a:graphic>
               <a:graphicData uri="http://schemas.openxmlformats.org/drawingml/2006/picture">
                 <pic:pic>
                   <pic:nvPicPr>
-                    <pic:cNvPr descr="短期模型拐点局部检验.png" id="52" name="Picture"/>
+                    <pic:cNvPr descr="短期模型拐点局部检验.png" id="56" name="Picture"/>
                     <pic:cNvPicPr>
                       <a:picLocks noChangeArrowheads="1" noChangeAspect="1"/>
                     </pic:cNvPicPr>
                   </pic:nvPicPr>
                   <pic:blipFill>
-                    <a:blip r:embed="rId50"/>
+                    <a:blip r:embed="rId54"/>
                     <a:stretch>
                       <a:fillRect/>
                     </a:stretch>
@@ -8004,8 +9207,8 @@
         <w:t xml:space="preserve">，而不能外推为普通时期的万能预测模型。</w:t>
       </w:r>
     </w:p>
-    <w:bookmarkEnd w:id="53"/>
-    <w:bookmarkStart w:id="63" w:name="参数自由度内生性与硬编码风险说明"/>
+    <w:bookmarkEnd w:id="57"/>
+    <w:bookmarkStart w:id="67" w:name="参数自由度内生性与硬编码风险说明"/>
     <w:p>
       <w:pPr>
         <w:pStyle w:val="Heading2"/>
@@ -8721,18 +9924,18 @@
           <wp:inline>
             <wp:extent cx="5067300" cy="2211185"/>
             <wp:effectExtent b="0" l="0" r="0" t="0"/>
-            <wp:docPr descr="" title="" id="55" name="Picture"/>
+            <wp:docPr descr="" title="" id="59" name="Picture"/>
             <a:graphic>
               <a:graphicData uri="http://schemas.openxmlformats.org/drawingml/2006/picture">
                 <pic:pic>
                   <pic:nvPicPr>
-                    <pic:cNvPr descr="短期模型过拟合压力测试.png" id="56" name="Picture"/>
+                    <pic:cNvPr descr="短期模型过拟合压力测试.png" id="60" name="Picture"/>
                     <pic:cNvPicPr>
                       <a:picLocks noChangeArrowheads="1" noChangeAspect="1"/>
                     </pic:cNvPicPr>
                   </pic:nvPicPr>
                   <pic:blipFill>
-                    <a:blip r:embed="rId54"/>
+                    <a:blip r:embed="rId58"/>
                     <a:stretch>
                       <a:fillRect/>
                     </a:stretch>
@@ -9102,18 +10305,18 @@
           <wp:inline>
             <wp:extent cx="5067300" cy="3774882"/>
             <wp:effectExtent b="0" l="0" r="0" t="0"/>
-            <wp:docPr descr="" title="" id="58" name="Picture"/>
+            <wp:docPr descr="" title="" id="62" name="Picture"/>
             <a:graphic>
               <a:graphicData uri="http://schemas.openxmlformats.org/drawingml/2006/picture">
                 <pic:pic>
                   <pic:nvPicPr>
-                    <pic:cNvPr descr="短期模型残差诊断增强.png" id="59" name="Picture"/>
+                    <pic:cNvPr descr="短期模型残差诊断增强.png" id="63" name="Picture"/>
                     <pic:cNvPicPr>
                       <a:picLocks noChangeArrowheads="1" noChangeAspect="1"/>
                     </pic:cNvPicPr>
                   </pic:nvPicPr>
                   <pic:blipFill>
-                    <a:blip r:embed="rId57"/>
+                    <a:blip r:embed="rId61"/>
                     <a:stretch>
                       <a:fillRect/>
                     </a:stretch>
@@ -9306,18 +10509,18 @@
           <wp:inline>
             <wp:extent cx="5067300" cy="2671849"/>
             <wp:effectExtent b="0" l="0" r="0" t="0"/>
-            <wp:docPr descr="" title="" id="61" name="Picture"/>
+            <wp:docPr descr="" title="" id="65" name="Picture"/>
             <a:graphic>
               <a:graphicData uri="http://schemas.openxmlformats.org/drawingml/2006/picture">
                 <pic:pic>
                   <pic:nvPicPr>
-                    <pic:cNvPr descr="短期模型稳健性带.png" id="62" name="Picture"/>
+                    <pic:cNvPr descr="短期模型稳健性带.png" id="66" name="Picture"/>
                     <pic:cNvPicPr>
                       <a:picLocks noChangeArrowheads="1" noChangeAspect="1"/>
                     </pic:cNvPicPr>
                   </pic:nvPicPr>
                   <pic:blipFill>
-                    <a:blip r:embed="rId60"/>
+                    <a:blip r:embed="rId64"/>
                     <a:stretch>
                       <a:fillRect/>
                     </a:stretch>
@@ -9366,9 +10569,9 @@
         <w:t xml:space="preserve">上述结果说明，当前短期模型不是由某一个偶然参数点支撑，而是在最优参数附近存在稳定的优秀参数邻域。这增强了后续情景预测使用该模型作为中性基准的可信度。</w:t>
       </w:r>
     </w:p>
-    <w:bookmarkEnd w:id="63"/>
-    <w:bookmarkEnd w:id="64"/>
-    <w:bookmarkStart w:id="65" w:name="模型评价与后续扩展"/>
+    <w:bookmarkEnd w:id="67"/>
+    <w:bookmarkEnd w:id="68"/>
+    <w:bookmarkStart w:id="69" w:name="模型评价与后续扩展"/>
     <w:p>
       <w:pPr>
         <w:pStyle w:val="Heading1"/>
@@ -9508,8 +10711,8 @@
         <w:t xml:space="preserve">的短期模型嵌入交互式展示系统，用于答辩演示和参数解释。</w:t>
       </w:r>
     </w:p>
-    <w:bookmarkEnd w:id="65"/>
-    <w:bookmarkStart w:id="67" w:name="结论"/>
+    <w:bookmarkEnd w:id="69"/>
+    <w:bookmarkStart w:id="71" w:name="结论"/>
     <w:p>
       <w:pPr>
         <w:pStyle w:val="Heading1"/>
@@ -9796,7 +10999,7 @@
       <w:r>
         <w:t xml:space="preserve"> </w:t>
       </w:r>
-      <w:hyperlink r:id="rId66">
+      <w:hyperlink r:id="rId70">
         <w:r>
           <w:rPr>
             <w:rStyle w:val="Hyperlink"/>
@@ -9805,7 +11008,7 @@
         </w:r>
       </w:hyperlink>
     </w:p>
-    <w:bookmarkEnd w:id="67"/>
+    <w:bookmarkEnd w:id="71"/>
     <w:sectPr>
       <w:footnotePr>
         <w:numRestart w:val="eachSect"/>

</xml_diff>

<commit_message>
Improve short-term model fit and refresh paper
</commit_message>
<xml_diff>
--- a/output/final/短期动态模型论文.docx
+++ b/output/final/短期动态模型论文.docx
@@ -79,7 +79,7 @@
         <w:rPr>
           <w:rFonts w:hint="eastAsia"/>
         </w:rPr>
-        <w:t xml:space="preserve">霍尔木兹海峡封锁会造成显著的原油运输中断。若直接采用静态供需弹性模型，油价上界容易被推高到远高于附件数据观测水平的区间。针对这一现象，本文以布伦特原油期货主力合约价格数据为基础，构建了一个用于解释冲突窗口短期油价演化的动态递推模型。模型将供应中断、战略石油储备释放、绕道运输恢复、商业库存缓冲、需求弹性调整、恐慌溢价、地缘风险溢价、缓冲确认折价和预期修复折价纳入统一框架，并通过固定种子多目标随机搜索、连续局部精修和局部稳健性复核进行参数校准。结果表明，精修后的短期动态模型在冲突窗口内取得</w:t>
+        <w:t xml:space="preserve">霍尔木兹海峡封锁会造成显著的原油运输中断。若直接采用静态供需弹性模型，油价上界容易被推高到远高于附件数据观测水平的区间。针对这一现象，本文以布伦特原油期货主力合约价格数据为基础，构建了一个用于解释冲突窗口短期油价演化的动态递推模型。模型将供应中断、战略石油储备释放、绕道运输恢复、商业库存缓冲、需求弹性调整、恐慌溢价、地缘风险溢价、缓冲确认折价和预期修复折价纳入统一框架，并通过固定种子多目标随机搜索、连续局部精修、局部稳健性复核和拟合质量精修进行参数校准。结果表明，精修后的短期动态模型在冲突窗口内取得</w:t>
       </w:r>
       <w:r>
         <w:t xml:space="preserve"> RMSE </w:t>
@@ -91,7 +91,7 @@
         <w:t xml:space="preserve">为</w:t>
       </w:r>
       <w:r>
-        <w:t xml:space="preserve"> 3.47 </w:t>
+        <w:t xml:space="preserve"> 3.44 </w:t>
       </w:r>
       <w:r>
         <w:rPr>
@@ -109,7 +109,7 @@
         <w:t xml:space="preserve">为</w:t>
       </w:r>
       <w:r>
-        <w:t xml:space="preserve"> 2.89 </w:t>
+        <w:t xml:space="preserve"> 2.85 </w:t>
       </w:r>
       <w:r>
         <w:rPr>
@@ -127,7 +127,7 @@
         <w:t xml:space="preserve">为</w:t>
       </w:r>
       <w:r>
-        <w:t xml:space="preserve"> 2.84 </w:t>
+        <w:t xml:space="preserve"> 2.81 </w:t>
       </w:r>
       <w:r>
         <w:rPr>
@@ -145,7 +145,7 @@
         <w:t xml:space="preserve">为</w:t>
       </w:r>
       <w:r>
-        <w:t xml:space="preserve"> 3.48 </w:t>
+        <w:t xml:space="preserve"> 3.38 </w:t>
       </w:r>
       <w:r>
         <w:rPr>
@@ -169,7 +169,7 @@
         <w:rPr>
           <w:rFonts w:hint="eastAsia"/>
         </w:rPr>
-        <w:t xml:space="preserve">22.4%，Theil</w:t>
+        <w:t xml:space="preserve">23.0%，Theil</w:t>
       </w:r>
       <w:r>
         <w:t xml:space="preserve"> U </w:t>
@@ -187,7 +187,7 @@
         <w:rPr>
           <w:rFonts w:hint="eastAsia"/>
         </w:rPr>
-        <w:t xml:space="preserve">0.78。模型不仅能解释价格冲击和高位平台，也能解释缓冲机制生效后的阶段性回落，并在局部参数扰动下保持稳定。该模型可作为后续</w:t>
+        <w:t xml:space="preserve">0.77。模型不仅能解释价格冲击和高位平台，也能解释缓冲机制生效后的阶段性回落，并在局部参数扰动下保持稳定。该模型可作为后续</w:t>
       </w:r>
       <w:r>
         <w:t xml:space="preserve"> 60–180 </w:t>
@@ -5142,7 +5142,7 @@
         <w:rPr>
           <w:rFonts w:hint="eastAsia"/>
         </w:rPr>
-        <w:t xml:space="preserve">参数校准分三步进行：第一步使用固定随机种子进行</w:t>
+        <w:t xml:space="preserve">参数校准分四步进行：第一步使用固定随机种子进行</w:t>
       </w:r>
       <w:r>
         <w:t xml:space="preserve"> 36000 </w:t>
@@ -5169,7 +5169,16 @@
         <w:rPr>
           <w:rFonts w:hint="eastAsia"/>
         </w:rPr>
-        <w:t xml:space="preserve">组局部扰动复核，从优秀邻域中选择综合得分更优且仍满足分段误差约束的参数组合。</w:t>
+        <w:t xml:space="preserve">组局部扰动复核，检查最优解附近是否存在稳定优质邻域；第四步在稳健性复核结果附近进行</w:t>
+      </w:r>
+      <w:r>
+        <w:t xml:space="preserve"> 60000 </w:t>
+      </w:r>
+      <w:r>
+        <w:rPr>
+          <w:rFonts w:hint="eastAsia"/>
+        </w:rPr>
+        <w:t xml:space="preserve">组拟合质量精修，重点改善中期平台、低价回落和末日误差，但不新增任何模型机制。</w:t>
       </w:r>
     </w:p>
     <w:bookmarkEnd w:id="24"/>
@@ -5298,7 +5307,7 @@
               <w:jc w:val="right"/>
             </w:pPr>
             <w:r>
-              <w:t xml:space="preserve">1488</w:t>
+              <w:t xml:space="preserve">1493</w:t>
             </w:r>
           </w:p>
         </w:tc>
@@ -5328,7 +5337,7 @@
               <w:jc w:val="right"/>
             </w:pPr>
             <w:r>
-              <w:t xml:space="preserve">673</w:t>
+              <w:t xml:space="preserve">670</w:t>
             </w:r>
           </w:p>
         </w:tc>
@@ -5360,7 +5369,7 @@
               <w:jc w:val="right"/>
             </w:pPr>
             <w:r>
-              <w:t xml:space="preserve">4</w:t>
+              <w:t xml:space="preserve">3</w:t>
             </w:r>
           </w:p>
         </w:tc>
@@ -5387,7 +5396,7 @@
               <w:jc w:val="right"/>
             </w:pPr>
             <w:r>
-              <w:t xml:space="preserve">10</w:t>
+              <w:t xml:space="preserve">8</w:t>
             </w:r>
           </w:p>
         </w:tc>
@@ -5416,7 +5425,7 @@
               <w:jc w:val="right"/>
             </w:pPr>
             <w:r>
-              <w:t xml:space="preserve">254</w:t>
+              <w:t xml:space="preserve">237</w:t>
             </w:r>
           </w:p>
         </w:tc>
@@ -5472,7 +5481,7 @@
               <w:jc w:val="right"/>
             </w:pPr>
             <w:r>
-              <w:t xml:space="preserve">0.13</w:t>
+              <w:t xml:space="preserve">0.12</w:t>
             </w:r>
           </w:p>
         </w:tc>
@@ -5528,7 +5537,7 @@
               <w:jc w:val="right"/>
             </w:pPr>
             <w:r>
-              <w:t xml:space="preserve">271</w:t>
+              <w:t xml:space="preserve">250</w:t>
             </w:r>
           </w:p>
         </w:tc>
@@ -5563,7 +5572,7 @@
               <w:jc w:val="right"/>
             </w:pPr>
             <w:r>
-              <w:t xml:space="preserve">0.349</w:t>
+              <w:t xml:space="preserve">0.344</w:t>
             </w:r>
           </w:p>
         </w:tc>
@@ -5600,7 +5609,7 @@
               <w:jc w:val="right"/>
             </w:pPr>
             <w:r>
-              <w:t xml:space="preserve">2.429</w:t>
+              <w:t xml:space="preserve">2.462</w:t>
             </w:r>
           </w:p>
         </w:tc>
@@ -5664,7 +5673,7 @@
               <w:jc w:val="right"/>
             </w:pPr>
             <w:r>
-              <w:t xml:space="preserve">0.213</w:t>
+              <w:t xml:space="preserve">0.220</w:t>
             </w:r>
           </w:p>
         </w:tc>
@@ -5751,7 +5760,7 @@
         <w:t xml:space="preserve">为</w:t>
       </w:r>
       <w:r>
-        <w:t xml:space="preserve"> 3.47 </w:t>
+        <w:t xml:space="preserve"> 3.44 </w:t>
       </w:r>
       <w:r>
         <w:rPr>
@@ -5769,7 +5778,7 @@
         <w:t xml:space="preserve">为</w:t>
       </w:r>
       <w:r>
-        <w:t xml:space="preserve"> 2.89 </w:t>
+        <w:t xml:space="preserve"> 2.85 </w:t>
       </w:r>
       <w:r>
         <w:rPr>
@@ -5778,7 +5787,7 @@
         <w:t xml:space="preserve">美元/桶的拟合结果。模拟峰值为</w:t>
       </w:r>
       <w:r>
-        <w:t xml:space="preserve"> 110.36 </w:t>
+        <w:t xml:space="preserve"> 110.42 </w:t>
       </w:r>
       <w:r>
         <w:rPr>
@@ -5796,7 +5805,7 @@
         <w:t xml:space="preserve">美元/桶，峰值略低估</w:t>
       </w:r>
       <w:r>
-        <w:t xml:space="preserve"> 3.70 </w:t>
+        <w:t xml:space="preserve"> 3.64 </w:t>
       </w:r>
       <w:r>
         <w:rPr>
@@ -5805,7 +5814,7 @@
         <w:t xml:space="preserve">美元/桶；末日模拟价格为</w:t>
       </w:r>
       <w:r>
-        <w:t xml:space="preserve"> 110.36 </w:t>
+        <w:t xml:space="preserve"> 110.42 </w:t>
       </w:r>
       <w:r>
         <w:rPr>
@@ -5823,7 +5832,7 @@
         <w:t xml:space="preserve">美元/桶，末日误差仅为</w:t>
       </w:r>
       <w:r>
-        <w:t xml:space="preserve"> 0.05 </w:t>
+        <w:t xml:space="preserve"> 0.11 </w:t>
       </w:r>
       <w:r>
         <w:rPr>
@@ -6038,31 +6047,31 @@
               <w:jc w:val="right"/>
             </w:pPr>
             <w:r>
-              <w:t xml:space="preserve">3.47</w:t>
-            </w:r>
-          </w:p>
-        </w:tc>
-        <w:tc>
-          <w:tcPr/>
-          <w:p>
-            <w:pPr>
-              <w:pStyle w:val="Compact"/>
-              <w:jc w:val="right"/>
-            </w:pPr>
-            <w:r>
-              <w:t xml:space="preserve">2.89</w:t>
-            </w:r>
-          </w:p>
-        </w:tc>
-        <w:tc>
-          <w:tcPr/>
-          <w:p>
-            <w:pPr>
-              <w:pStyle w:val="Compact"/>
-              <w:jc w:val="right"/>
-            </w:pPr>
-            <w:r>
-              <w:t xml:space="preserve">7.39</w:t>
+              <w:t xml:space="preserve">3.44</w:t>
+            </w:r>
+          </w:p>
+        </w:tc>
+        <w:tc>
+          <w:tcPr/>
+          <w:p>
+            <w:pPr>
+              <w:pStyle w:val="Compact"/>
+              <w:jc w:val="right"/>
+            </w:pPr>
+            <w:r>
+              <w:t xml:space="preserve">2.85</w:t>
+            </w:r>
+          </w:p>
+        </w:tc>
+        <w:tc>
+          <w:tcPr/>
+          <w:p>
+            <w:pPr>
+              <w:pStyle w:val="Compact"/>
+              <w:jc w:val="right"/>
+            </w:pPr>
+            <w:r>
+              <w:t xml:space="preserve">7.43</w:t>
             </w:r>
           </w:p>
         </w:tc>
@@ -6103,31 +6112,31 @@
               <w:jc w:val="right"/>
             </w:pPr>
             <w:r>
-              <w:t xml:space="preserve">3.16</w:t>
-            </w:r>
-          </w:p>
-        </w:tc>
-        <w:tc>
-          <w:tcPr/>
-          <w:p>
-            <w:pPr>
-              <w:pStyle w:val="Compact"/>
-              <w:jc w:val="right"/>
-            </w:pPr>
-            <w:r>
-              <w:t xml:space="preserve">2.76</w:t>
-            </w:r>
-          </w:p>
-        </w:tc>
-        <w:tc>
-          <w:tcPr/>
-          <w:p>
-            <w:pPr>
-              <w:pStyle w:val="Compact"/>
-              <w:jc w:val="right"/>
-            </w:pPr>
-            <w:r>
-              <w:t xml:space="preserve">6.10</w:t>
+              <w:t xml:space="preserve">3.14</w:t>
+            </w:r>
+          </w:p>
+        </w:tc>
+        <w:tc>
+          <w:tcPr/>
+          <w:p>
+            <w:pPr>
+              <w:pStyle w:val="Compact"/>
+              <w:jc w:val="right"/>
+            </w:pPr>
+            <w:r>
+              <w:t xml:space="preserve">2.72</w:t>
+            </w:r>
+          </w:p>
+        </w:tc>
+        <w:tc>
+          <w:tcPr/>
+          <w:p>
+            <w:pPr>
+              <w:pStyle w:val="Compact"/>
+              <w:jc w:val="right"/>
+            </w:pPr>
+            <w:r>
+              <w:t xml:space="preserve">5.91</w:t>
             </w:r>
           </w:p>
         </w:tc>
@@ -6168,31 +6177,31 @@
               <w:jc w:val="right"/>
             </w:pPr>
             <w:r>
-              <w:t xml:space="preserve">4.42</w:t>
-            </w:r>
-          </w:p>
-        </w:tc>
-        <w:tc>
-          <w:tcPr/>
-          <w:p>
-            <w:pPr>
-              <w:pStyle w:val="Compact"/>
-              <w:jc w:val="right"/>
-            </w:pPr>
-            <w:r>
-              <w:t xml:space="preserve">3.75</w:t>
-            </w:r>
-          </w:p>
-        </w:tc>
-        <w:tc>
-          <w:tcPr/>
-          <w:p>
-            <w:pPr>
-              <w:pStyle w:val="Compact"/>
-              <w:jc w:val="right"/>
-            </w:pPr>
-            <w:r>
-              <w:t xml:space="preserve">7.39</w:t>
+              <w:t xml:space="preserve">4.39</w:t>
+            </w:r>
+          </w:p>
+        </w:tc>
+        <w:tc>
+          <w:tcPr/>
+          <w:p>
+            <w:pPr>
+              <w:pStyle w:val="Compact"/>
+              <w:jc w:val="right"/>
+            </w:pPr>
+            <w:r>
+              <w:t xml:space="preserve">3.72</w:t>
+            </w:r>
+          </w:p>
+        </w:tc>
+        <w:tc>
+          <w:tcPr/>
+          <w:p>
+            <w:pPr>
+              <w:pStyle w:val="Compact"/>
+              <w:jc w:val="right"/>
+            </w:pPr>
+            <w:r>
+              <w:t xml:space="preserve">7.43</w:t>
             </w:r>
           </w:p>
         </w:tc>
@@ -6233,31 +6242,31 @@
               <w:jc w:val="right"/>
             </w:pPr>
             <w:r>
-              <w:t xml:space="preserve">2.84</w:t>
-            </w:r>
-          </w:p>
-        </w:tc>
-        <w:tc>
-          <w:tcPr/>
-          <w:p>
-            <w:pPr>
-              <w:pStyle w:val="Compact"/>
-              <w:jc w:val="right"/>
-            </w:pPr>
-            <w:r>
-              <w:t xml:space="preserve">2.38</w:t>
-            </w:r>
-          </w:p>
-        </w:tc>
-        <w:tc>
-          <w:tcPr/>
-          <w:p>
-            <w:pPr>
-              <w:pStyle w:val="Compact"/>
-              <w:jc w:val="right"/>
-            </w:pPr>
-            <w:r>
-              <w:t xml:space="preserve">5.29</w:t>
+              <w:t xml:space="preserve">2.81</w:t>
+            </w:r>
+          </w:p>
+        </w:tc>
+        <w:tc>
+          <w:tcPr/>
+          <w:p>
+            <w:pPr>
+              <w:pStyle w:val="Compact"/>
+              <w:jc w:val="right"/>
+            </w:pPr>
+            <w:r>
+              <w:t xml:space="preserve">2.35</w:t>
+            </w:r>
+          </w:p>
+        </w:tc>
+        <w:tc>
+          <w:tcPr/>
+          <w:p>
+            <w:pPr>
+              <w:pStyle w:val="Compact"/>
+              <w:jc w:val="right"/>
+            </w:pPr>
+            <w:r>
+              <w:t xml:space="preserve">5.24</w:t>
             </w:r>
           </w:p>
         </w:tc>
@@ -6310,19 +6319,19 @@
               <w:jc w:val="right"/>
             </w:pPr>
             <w:r>
-              <w:t xml:space="preserve">2.32</w:t>
-            </w:r>
-          </w:p>
-        </w:tc>
-        <w:tc>
-          <w:tcPr/>
-          <w:p>
-            <w:pPr>
-              <w:pStyle w:val="Compact"/>
-              <w:jc w:val="right"/>
-            </w:pPr>
-            <w:r>
-              <w:t xml:space="preserve">3.94</w:t>
+              <w:t xml:space="preserve">2.34</w:t>
+            </w:r>
+          </w:p>
+        </w:tc>
+        <w:tc>
+          <w:tcPr/>
+          <w:p>
+            <w:pPr>
+              <w:pStyle w:val="Compact"/>
+              <w:jc w:val="right"/>
+            </w:pPr>
+            <w:r>
+              <w:t xml:space="preserve">3.91</w:t>
             </w:r>
           </w:p>
         </w:tc>
@@ -6363,31 +6372,31 @@
               <w:jc w:val="right"/>
             </w:pPr>
             <w:r>
-              <w:t xml:space="preserve">3.48</w:t>
-            </w:r>
-          </w:p>
-        </w:tc>
-        <w:tc>
-          <w:tcPr/>
-          <w:p>
-            <w:pPr>
-              <w:pStyle w:val="Compact"/>
-              <w:jc w:val="right"/>
-            </w:pPr>
-            <w:r>
-              <w:t xml:space="preserve">3.05</w:t>
-            </w:r>
-          </w:p>
-        </w:tc>
-        <w:tc>
-          <w:tcPr/>
-          <w:p>
-            <w:pPr>
-              <w:pStyle w:val="Compact"/>
-              <w:jc w:val="right"/>
-            </w:pPr>
-            <w:r>
-              <w:t xml:space="preserve">6.10</w:t>
+              <w:t xml:space="preserve">3.38</w:t>
+            </w:r>
+          </w:p>
+        </w:tc>
+        <w:tc>
+          <w:tcPr/>
+          <w:p>
+            <w:pPr>
+              <w:pStyle w:val="Compact"/>
+              <w:jc w:val="right"/>
+            </w:pPr>
+            <w:r>
+              <w:t xml:space="preserve">2.94</w:t>
+            </w:r>
+          </w:p>
+        </w:tc>
+        <w:tc>
+          <w:tcPr/>
+          <w:p>
+            <w:pPr>
+              <w:pStyle w:val="Compact"/>
+              <w:jc w:val="right"/>
+            </w:pPr>
+            <w:r>
+              <w:t xml:space="preserve">5.91</w:t>
             </w:r>
           </w:p>
         </w:tc>
@@ -6431,7 +6440,7 @@
         <w:t xml:space="preserve">降至</w:t>
       </w:r>
       <w:r>
-        <w:t xml:space="preserve"> 2.84 </w:t>
+        <w:t xml:space="preserve"> 2.81 </w:t>
       </w:r>
       <w:r>
         <w:rPr>
@@ -6739,7 +6748,7 @@
               <w:jc w:val="right"/>
             </w:pPr>
             <w:r>
-              <w:t xml:space="preserve">3.47</w:t>
+              <w:t xml:space="preserve">3.44</w:t>
             </w:r>
           </w:p>
         </w:tc>
@@ -6763,19 +6772,19 @@
               <w:jc w:val="right"/>
             </w:pPr>
             <w:r>
-              <w:t xml:space="preserve">2.84</w:t>
-            </w:r>
-          </w:p>
-        </w:tc>
-        <w:tc>
-          <w:tcPr/>
-          <w:p>
-            <w:pPr>
-              <w:pStyle w:val="Compact"/>
-              <w:jc w:val="right"/>
-            </w:pPr>
-            <w:r>
-              <w:t xml:space="preserve">3.48</w:t>
+              <w:t xml:space="preserve">2.81</w:t>
+            </w:r>
+          </w:p>
+        </w:tc>
+        <w:tc>
+          <w:tcPr/>
+          <w:p>
+            <w:pPr>
+              <w:pStyle w:val="Compact"/>
+              <w:jc w:val="right"/>
+            </w:pPr>
+            <w:r>
+              <w:t xml:space="preserve">3.38</w:t>
             </w:r>
           </w:p>
         </w:tc>
@@ -6813,43 +6822,43 @@
               <w:jc w:val="right"/>
             </w:pPr>
             <w:r>
-              <w:t xml:space="preserve">5.55</w:t>
-            </w:r>
-          </w:p>
-        </w:tc>
-        <w:tc>
-          <w:tcPr/>
-          <w:p>
-            <w:pPr>
-              <w:pStyle w:val="Compact"/>
-              <w:jc w:val="right"/>
-            </w:pPr>
-            <w:r>
-              <w:t xml:space="preserve">+2.08</w:t>
-            </w:r>
-          </w:p>
-        </w:tc>
-        <w:tc>
-          <w:tcPr/>
-          <w:p>
-            <w:pPr>
-              <w:pStyle w:val="Compact"/>
-              <w:jc w:val="right"/>
-            </w:pPr>
-            <w:r>
-              <w:t xml:space="preserve">5.37</w:t>
-            </w:r>
-          </w:p>
-        </w:tc>
-        <w:tc>
-          <w:tcPr/>
-          <w:p>
-            <w:pPr>
-              <w:pStyle w:val="Compact"/>
-              <w:jc w:val="right"/>
-            </w:pPr>
-            <w:r>
-              <w:t xml:space="preserve">6.13</w:t>
+              <w:t xml:space="preserve">5.86</w:t>
+            </w:r>
+          </w:p>
+        </w:tc>
+        <w:tc>
+          <w:tcPr/>
+          <w:p>
+            <w:pPr>
+              <w:pStyle w:val="Compact"/>
+              <w:jc w:val="right"/>
+            </w:pPr>
+            <w:r>
+              <w:t xml:space="preserve">+2.42</w:t>
+            </w:r>
+          </w:p>
+        </w:tc>
+        <w:tc>
+          <w:tcPr/>
+          <w:p>
+            <w:pPr>
+              <w:pStyle w:val="Compact"/>
+              <w:jc w:val="right"/>
+            </w:pPr>
+            <w:r>
+              <w:t xml:space="preserve">5.84</w:t>
+            </w:r>
+          </w:p>
+        </w:tc>
+        <w:tc>
+          <w:tcPr/>
+          <w:p>
+            <w:pPr>
+              <w:pStyle w:val="Compact"/>
+              <w:jc w:val="right"/>
+            </w:pPr>
+            <w:r>
+              <w:t xml:space="preserve">6.46</w:t>
             </w:r>
           </w:p>
         </w:tc>
@@ -6878,7 +6887,7 @@
               <w:jc w:val="right"/>
             </w:pPr>
             <w:r>
-              <w:t xml:space="preserve">3.50</w:t>
+              <w:t xml:space="preserve">3.47</w:t>
             </w:r>
           </w:p>
         </w:tc>
@@ -6902,19 +6911,19 @@
               <w:jc w:val="right"/>
             </w:pPr>
             <w:r>
-              <w:t xml:space="preserve">2.79</w:t>
-            </w:r>
-          </w:p>
-        </w:tc>
-        <w:tc>
-          <w:tcPr/>
-          <w:p>
-            <w:pPr>
-              <w:pStyle w:val="Compact"/>
-              <w:jc w:val="right"/>
-            </w:pPr>
-            <w:r>
-              <w:t xml:space="preserve">3.67</w:t>
+              <w:t xml:space="preserve">2.75</w:t>
+            </w:r>
+          </w:p>
+        </w:tc>
+        <w:tc>
+          <w:tcPr/>
+          <w:p>
+            <w:pPr>
+              <w:pStyle w:val="Compact"/>
+              <w:jc w:val="right"/>
+            </w:pPr>
+            <w:r>
+              <w:t xml:space="preserve">3.55</w:t>
             </w:r>
           </w:p>
         </w:tc>
@@ -6943,43 +6952,43 @@
               <w:jc w:val="right"/>
             </w:pPr>
             <w:r>
-              <w:t xml:space="preserve">3.48</w:t>
-            </w:r>
-          </w:p>
-        </w:tc>
-        <w:tc>
-          <w:tcPr/>
-          <w:p>
-            <w:pPr>
-              <w:pStyle w:val="Compact"/>
-              <w:jc w:val="right"/>
-            </w:pPr>
-            <w:r>
-              <w:t xml:space="preserve">+0.01</w:t>
-            </w:r>
-          </w:p>
-        </w:tc>
-        <w:tc>
-          <w:tcPr/>
-          <w:p>
-            <w:pPr>
-              <w:pStyle w:val="Compact"/>
-              <w:jc w:val="right"/>
-            </w:pPr>
-            <w:r>
-              <w:t xml:space="preserve">2.79</w:t>
-            </w:r>
-          </w:p>
-        </w:tc>
-        <w:tc>
-          <w:tcPr/>
-          <w:p>
-            <w:pPr>
-              <w:pStyle w:val="Compact"/>
-              <w:jc w:val="right"/>
-            </w:pPr>
-            <w:r>
-              <w:t xml:space="preserve">3.56</w:t>
+              <w:t xml:space="preserve">3.46</w:t>
+            </w:r>
+          </w:p>
+        </w:tc>
+        <w:tc>
+          <w:tcPr/>
+          <w:p>
+            <w:pPr>
+              <w:pStyle w:val="Compact"/>
+              <w:jc w:val="right"/>
+            </w:pPr>
+            <w:r>
+              <w:t xml:space="preserve">+0.02</w:t>
+            </w:r>
+          </w:p>
+        </w:tc>
+        <w:tc>
+          <w:tcPr/>
+          <w:p>
+            <w:pPr>
+              <w:pStyle w:val="Compact"/>
+              <w:jc w:val="right"/>
+            </w:pPr>
+            <w:r>
+              <w:t xml:space="preserve">2.75</w:t>
+            </w:r>
+          </w:p>
+        </w:tc>
+        <w:tc>
+          <w:tcPr/>
+          <w:p>
+            <w:pPr>
+              <w:pStyle w:val="Compact"/>
+              <w:jc w:val="right"/>
+            </w:pPr>
+            <w:r>
+              <w:t xml:space="preserve">3.47</w:t>
             </w:r>
           </w:p>
         </w:tc>
@@ -7008,43 +7017,43 @@
               <w:jc w:val="right"/>
             </w:pPr>
             <w:r>
-              <w:t xml:space="preserve">4.58</w:t>
-            </w:r>
-          </w:p>
-        </w:tc>
-        <w:tc>
-          <w:tcPr/>
-          <w:p>
-            <w:pPr>
-              <w:pStyle w:val="Compact"/>
-              <w:jc w:val="right"/>
-            </w:pPr>
-            <w:r>
-              <w:t xml:space="preserve">+1.11</w:t>
-            </w:r>
-          </w:p>
-        </w:tc>
-        <w:tc>
-          <w:tcPr/>
-          <w:p>
-            <w:pPr>
-              <w:pStyle w:val="Compact"/>
-              <w:jc w:val="right"/>
-            </w:pPr>
-            <w:r>
-              <w:t xml:space="preserve">2.61</w:t>
-            </w:r>
-          </w:p>
-        </w:tc>
-        <w:tc>
-          <w:tcPr/>
-          <w:p>
-            <w:pPr>
-              <w:pStyle w:val="Compact"/>
-              <w:jc w:val="right"/>
-            </w:pPr>
-            <w:r>
-              <w:t xml:space="preserve">5.07</w:t>
+              <w:t xml:space="preserve">4.64</w:t>
+            </w:r>
+          </w:p>
+        </w:tc>
+        <w:tc>
+          <w:tcPr/>
+          <w:p>
+            <w:pPr>
+              <w:pStyle w:val="Compact"/>
+              <w:jc w:val="right"/>
+            </w:pPr>
+            <w:r>
+              <w:t xml:space="preserve">+1.20</w:t>
+            </w:r>
+          </w:p>
+        </w:tc>
+        <w:tc>
+          <w:tcPr/>
+          <w:p>
+            <w:pPr>
+              <w:pStyle w:val="Compact"/>
+              <w:jc w:val="right"/>
+            </w:pPr>
+            <w:r>
+              <w:t xml:space="preserve">2.69</w:t>
+            </w:r>
+          </w:p>
+        </w:tc>
+        <w:tc>
+          <w:tcPr/>
+          <w:p>
+            <w:pPr>
+              <w:pStyle w:val="Compact"/>
+              <w:jc w:val="right"/>
+            </w:pPr>
+            <w:r>
+              <w:t xml:space="preserve">5.16</w:t>
             </w:r>
           </w:p>
         </w:tc>
@@ -7073,43 +7082,43 @@
               <w:jc w:val="right"/>
             </w:pPr>
             <w:r>
-              <w:t xml:space="preserve">3.64</w:t>
-            </w:r>
-          </w:p>
-        </w:tc>
-        <w:tc>
-          <w:tcPr/>
-          <w:p>
-            <w:pPr>
-              <w:pStyle w:val="Compact"/>
-              <w:jc w:val="right"/>
-            </w:pPr>
-            <w:r>
-              <w:t xml:space="preserve">+0.17</w:t>
-            </w:r>
-          </w:p>
-        </w:tc>
-        <w:tc>
-          <w:tcPr/>
-          <w:p>
-            <w:pPr>
-              <w:pStyle w:val="Compact"/>
-              <w:jc w:val="right"/>
-            </w:pPr>
-            <w:r>
-              <w:t xml:space="preserve">2.82</w:t>
-            </w:r>
-          </w:p>
-        </w:tc>
-        <w:tc>
-          <w:tcPr/>
-          <w:p>
-            <w:pPr>
-              <w:pStyle w:val="Compact"/>
-              <w:jc w:val="right"/>
-            </w:pPr>
-            <w:r>
-              <w:t xml:space="preserve">3.48</w:t>
+              <w:t xml:space="preserve">3.62</w:t>
+            </w:r>
+          </w:p>
+        </w:tc>
+        <w:tc>
+          <w:tcPr/>
+          <w:p>
+            <w:pPr>
+              <w:pStyle w:val="Compact"/>
+              <w:jc w:val="right"/>
+            </w:pPr>
+            <w:r>
+              <w:t xml:space="preserve">+0.18</w:t>
+            </w:r>
+          </w:p>
+        </w:tc>
+        <w:tc>
+          <w:tcPr/>
+          <w:p>
+            <w:pPr>
+              <w:pStyle w:val="Compact"/>
+              <w:jc w:val="right"/>
+            </w:pPr>
+            <w:r>
+              <w:t xml:space="preserve">2.79</w:t>
+            </w:r>
+          </w:p>
+        </w:tc>
+        <w:tc>
+          <w:tcPr/>
+          <w:p>
+            <w:pPr>
+              <w:pStyle w:val="Compact"/>
+              <w:jc w:val="right"/>
+            </w:pPr>
+            <w:r>
+              <w:t xml:space="preserve">3.43</w:t>
             </w:r>
           </w:p>
         </w:tc>
@@ -7138,43 +7147,43 @@
               <w:jc w:val="right"/>
             </w:pPr>
             <w:r>
-              <w:t xml:space="preserve">30.79</w:t>
-            </w:r>
-          </w:p>
-        </w:tc>
-        <w:tc>
-          <w:tcPr/>
-          <w:p>
-            <w:pPr>
-              <w:pStyle w:val="Compact"/>
-              <w:jc w:val="right"/>
-            </w:pPr>
-            <w:r>
-              <w:t xml:space="preserve">+27.32</w:t>
-            </w:r>
-          </w:p>
-        </w:tc>
-        <w:tc>
-          <w:tcPr/>
-          <w:p>
-            <w:pPr>
-              <w:pStyle w:val="Compact"/>
-              <w:jc w:val="right"/>
-            </w:pPr>
-            <w:r>
-              <w:t xml:space="preserve">36.17</w:t>
-            </w:r>
-          </w:p>
-        </w:tc>
-        <w:tc>
-          <w:tcPr/>
-          <w:p>
-            <w:pPr>
-              <w:pStyle w:val="Compact"/>
-              <w:jc w:val="right"/>
-            </w:pPr>
-            <w:r>
-              <w:t xml:space="preserve">25.84</w:t>
+              <w:t xml:space="preserve">30.69</w:t>
+            </w:r>
+          </w:p>
+        </w:tc>
+        <w:tc>
+          <w:tcPr/>
+          <w:p>
+            <w:pPr>
+              <w:pStyle w:val="Compact"/>
+              <w:jc w:val="right"/>
+            </w:pPr>
+            <w:r>
+              <w:t xml:space="preserve">+27.25</w:t>
+            </w:r>
+          </w:p>
+        </w:tc>
+        <w:tc>
+          <w:tcPr/>
+          <w:p>
+            <w:pPr>
+              <w:pStyle w:val="Compact"/>
+              <w:jc w:val="right"/>
+            </w:pPr>
+            <w:r>
+              <w:t xml:space="preserve">36.02</w:t>
+            </w:r>
+          </w:p>
+        </w:tc>
+        <w:tc>
+          <w:tcPr/>
+          <w:p>
+            <w:pPr>
+              <w:pStyle w:val="Compact"/>
+              <w:jc w:val="right"/>
+            </w:pPr>
+            <w:r>
+              <w:t xml:space="preserve">25.71</w:t>
             </w:r>
           </w:p>
         </w:tc>
@@ -7203,43 +7212,43 @@
               <w:jc w:val="right"/>
             </w:pPr>
             <w:r>
-              <w:t xml:space="preserve">4.81</w:t>
-            </w:r>
-          </w:p>
-        </w:tc>
-        <w:tc>
-          <w:tcPr/>
-          <w:p>
-            <w:pPr>
-              <w:pStyle w:val="Compact"/>
-              <w:jc w:val="right"/>
-            </w:pPr>
-            <w:r>
-              <w:t xml:space="preserve">+1.35</w:t>
-            </w:r>
-          </w:p>
-        </w:tc>
-        <w:tc>
-          <w:tcPr/>
-          <w:p>
-            <w:pPr>
-              <w:pStyle w:val="Compact"/>
-              <w:jc w:val="right"/>
-            </w:pPr>
-            <w:r>
-              <w:t xml:space="preserve">3.92</w:t>
-            </w:r>
-          </w:p>
-        </w:tc>
-        <w:tc>
-          <w:tcPr/>
-          <w:p>
-            <w:pPr>
-              <w:pStyle w:val="Compact"/>
-              <w:jc w:val="right"/>
-            </w:pPr>
-            <w:r>
-              <w:t xml:space="preserve">5.86</w:t>
+              <w:t xml:space="preserve">5.07</w:t>
+            </w:r>
+          </w:p>
+        </w:tc>
+        <w:tc>
+          <w:tcPr/>
+          <w:p>
+            <w:pPr>
+              <w:pStyle w:val="Compact"/>
+              <w:jc w:val="right"/>
+            </w:pPr>
+            <w:r>
+              <w:t xml:space="preserve">+1.63</w:t>
+            </w:r>
+          </w:p>
+        </w:tc>
+        <w:tc>
+          <w:tcPr/>
+          <w:p>
+            <w:pPr>
+              <w:pStyle w:val="Compact"/>
+              <w:jc w:val="right"/>
+            </w:pPr>
+            <w:r>
+              <w:t xml:space="preserve">4.33</w:t>
+            </w:r>
+          </w:p>
+        </w:tc>
+        <w:tc>
+          <w:tcPr/>
+          <w:p>
+            <w:pPr>
+              <w:pStyle w:val="Compact"/>
+              <w:jc w:val="right"/>
+            </w:pPr>
+            <w:r>
+              <w:t xml:space="preserve">6.18</w:t>
             </w:r>
           </w:p>
         </w:tc>
@@ -7268,43 +7277,43 @@
               <w:jc w:val="right"/>
             </w:pPr>
             <w:r>
-              <w:t xml:space="preserve">7.48</w:t>
-            </w:r>
-          </w:p>
-        </w:tc>
-        <w:tc>
-          <w:tcPr/>
-          <w:p>
-            <w:pPr>
-              <w:pStyle w:val="Compact"/>
-              <w:jc w:val="right"/>
-            </w:pPr>
-            <w:r>
-              <w:t xml:space="preserve">+4.01</w:t>
-            </w:r>
-          </w:p>
-        </w:tc>
-        <w:tc>
-          <w:tcPr/>
-          <w:p>
-            <w:pPr>
-              <w:pStyle w:val="Compact"/>
-              <w:jc w:val="right"/>
-            </w:pPr>
-            <w:r>
-              <w:t xml:space="preserve">10.36</w:t>
-            </w:r>
-          </w:p>
-        </w:tc>
-        <w:tc>
-          <w:tcPr/>
-          <w:p>
-            <w:pPr>
-              <w:pStyle w:val="Compact"/>
-              <w:jc w:val="right"/>
-            </w:pPr>
-            <w:r>
-              <w:t xml:space="preserve">10.05</w:t>
+              <w:t xml:space="preserve">7.31</w:t>
+            </w:r>
+          </w:p>
+        </w:tc>
+        <w:tc>
+          <w:tcPr/>
+          <w:p>
+            <w:pPr>
+              <w:pStyle w:val="Compact"/>
+              <w:jc w:val="right"/>
+            </w:pPr>
+            <w:r>
+              <w:t xml:space="preserve">+3.87</w:t>
+            </w:r>
+          </w:p>
+        </w:tc>
+        <w:tc>
+          <w:tcPr/>
+          <w:p>
+            <w:pPr>
+              <w:pStyle w:val="Compact"/>
+              <w:jc w:val="right"/>
+            </w:pPr>
+            <w:r>
+              <w:t xml:space="preserve">10.09</w:t>
+            </w:r>
+          </w:p>
+        </w:tc>
+        <w:tc>
+          <w:tcPr/>
+          <w:p>
+            <w:pPr>
+              <w:pStyle w:val="Compact"/>
+              <w:jc w:val="right"/>
+            </w:pPr>
+            <w:r>
+              <w:t xml:space="preserve">9.77</w:t>
             </w:r>
           </w:p>
         </w:tc>
@@ -7333,19 +7342,19 @@
               <w:jc w:val="right"/>
             </w:pPr>
             <w:r>
-              <w:t xml:space="preserve">26.94</w:t>
-            </w:r>
-          </w:p>
-        </w:tc>
-        <w:tc>
-          <w:tcPr/>
-          <w:p>
-            <w:pPr>
-              <w:pStyle w:val="Compact"/>
-              <w:jc w:val="right"/>
-            </w:pPr>
-            <w:r>
-              <w:t xml:space="preserve">+23.48</w:t>
+              <w:t xml:space="preserve">26.99</w:t>
+            </w:r>
+          </w:p>
+        </w:tc>
+        <w:tc>
+          <w:tcPr/>
+          <w:p>
+            <w:pPr>
+              <w:pStyle w:val="Compact"/>
+              <w:jc w:val="right"/>
+            </w:pPr>
+            <w:r>
+              <w:t xml:space="preserve">+23.55</w:t>
             </w:r>
           </w:p>
         </w:tc>
@@ -7369,7 +7378,7 @@
               <w:jc w:val="right"/>
             </w:pPr>
             <w:r>
-              <w:t xml:space="preserve">18.83</w:t>
+              <w:t xml:space="preserve">18.90</w:t>
             </w:r>
           </w:p>
         </w:tc>
@@ -7489,7 +7498,7 @@
         <w:t xml:space="preserve">从</w:t>
       </w:r>
       <w:r>
-        <w:t xml:space="preserve"> 3.47 </w:t>
+        <w:t xml:space="preserve"> 3.44 </w:t>
       </w:r>
       <w:r>
         <w:rPr>
@@ -7504,7 +7513,7 @@
         <w:rPr>
           <w:rFonts w:hint="eastAsia"/>
         </w:rPr>
-        <w:t xml:space="preserve">5.55，说明题面政策缓冲机制并非装饰项；去除需求收缩后低价回落</w:t>
+        <w:t xml:space="preserve">5.86，说明题面政策缓冲机制并非装饰项；去除需求收缩后低价回落</w:t>
       </w:r>
       <w:r>
         <w:t xml:space="preserve"> RMSE </w:t>
@@ -7522,7 +7531,7 @@
         <w:rPr>
           <w:rFonts w:hint="eastAsia"/>
         </w:rPr>
-        <w:t xml:space="preserve">5.07，说明需求侧调整对解释后期回落有作用。商业库存和绕道运输在当前</w:t>
+        <w:t xml:space="preserve">5.16，说明需求侧调整对解释后期回落有作用。商业库存和绕道运输在当前</w:t>
       </w:r>
       <w:r>
         <w:t xml:space="preserve"> 46 </w:t>
@@ -7563,7 +7572,7 @@
         <w:t xml:space="preserve">从</w:t>
       </w:r>
       <w:r>
-        <w:t xml:space="preserve"> 2.84 </w:t>
+        <w:t xml:space="preserve"> 2.81 </w:t>
       </w:r>
       <w:r>
         <w:rPr>
@@ -7578,7 +7587,7 @@
         <w:rPr>
           <w:rFonts w:hint="eastAsia"/>
         </w:rPr>
-        <w:t xml:space="preserve">10.36，说明该项主要负责解释缓冲机制被市场确认后的阶段性回落。由此，完整模型不是把题面机制替换掉，而是在题面物理供需层之上加入期货价格形成层：物理机制决定缺口与缓冲底座，市场价格形成机制决定价格如何消化这些信息。</w:t>
+        <w:t xml:space="preserve">10.09，说明该项主要负责解释缓冲机制被市场确认后的阶段性回落。由此，完整模型不是把题面机制替换掉，而是在题面物理供需层之上加入期货价格形成层：物理机制决定缺口与缓冲底座，市场价格形成机制决定价格如何消化这些信息。</w:t>
       </w:r>
     </w:p>
     <w:bookmarkEnd w:id="42"/>
@@ -7829,7 +7838,7 @@
               <w:jc w:val="right"/>
             </w:pPr>
             <w:r>
-              <w:t xml:space="preserve">3.47</w:t>
+              <w:t xml:space="preserve">3.44</w:t>
             </w:r>
           </w:p>
         </w:tc>
@@ -7870,7 +7879,7 @@
               <w:jc w:val="right"/>
             </w:pPr>
             <w:r>
-              <w:t xml:space="preserve">2.89</w:t>
+              <w:t xml:space="preserve">2.85</w:t>
             </w:r>
           </w:p>
         </w:tc>
@@ -7911,7 +7920,7 @@
               <w:jc w:val="right"/>
             </w:pPr>
             <w:r>
-              <w:t xml:space="preserve">2.90%</w:t>
+              <w:t xml:space="preserve">2.86%</w:t>
             </w:r>
           </w:p>
         </w:tc>
@@ -7963,7 +7972,7 @@
               <w:jc w:val="right"/>
             </w:pPr>
             <w:r>
-              <w:t xml:space="preserve">0.824</w:t>
+              <w:t xml:space="preserve">0.826</w:t>
             </w:r>
           </w:p>
         </w:tc>
@@ -8004,7 +8013,7 @@
               <w:jc w:val="right"/>
             </w:pPr>
             <w:r>
-              <w:t xml:space="preserve">0.776</w:t>
+              <w:t xml:space="preserve">0.770</w:t>
             </w:r>
           </w:p>
         </w:tc>
@@ -8060,7 +8069,7 @@
               <w:jc w:val="right"/>
             </w:pPr>
             <w:r>
-              <w:t xml:space="preserve">22.4%</w:t>
+              <w:t xml:space="preserve">23.0%</w:t>
             </w:r>
           </w:p>
         </w:tc>
@@ -8148,7 +8157,7 @@
               <w:jc w:val="right"/>
             </w:pPr>
             <w:r>
-              <w:t xml:space="preserve">0.263</w:t>
+              <w:t xml:space="preserve">0.254</w:t>
             </w:r>
           </w:p>
         </w:tc>
@@ -8213,7 +8222,7 @@
         <w:rPr>
           <w:rFonts w:hint="eastAsia"/>
         </w:rPr>
-        <w:t xml:space="preserve">0.776，说明模型中的供需、风险和缓冲机制提供了价格惯性之外的解释力。</w:t>
+        <w:t xml:space="preserve">0.770，说明模型中的供需、风险和缓冲机制提供了价格惯性之外的解释力。</w:t>
       </w:r>
     </w:p>
     <w:bookmarkEnd w:id="47"/>
@@ -8421,31 +8430,31 @@
               <w:jc w:val="right"/>
             </w:pPr>
             <w:r>
-              <w:t xml:space="preserve">3.47</w:t>
-            </w:r>
-          </w:p>
-        </w:tc>
-        <w:tc>
-          <w:tcPr/>
-          <w:p>
-            <w:pPr>
-              <w:pStyle w:val="Compact"/>
-              <w:jc w:val="right"/>
-            </w:pPr>
-            <w:r>
-              <w:t xml:space="preserve">2.89</w:t>
-            </w:r>
-          </w:p>
-        </w:tc>
-        <w:tc>
-          <w:tcPr/>
-          <w:p>
-            <w:pPr>
-              <w:pStyle w:val="Compact"/>
-              <w:jc w:val="right"/>
-            </w:pPr>
-            <w:r>
-              <w:t xml:space="preserve">2.90%</w:t>
+              <w:t xml:space="preserve">3.44</w:t>
+            </w:r>
+          </w:p>
+        </w:tc>
+        <w:tc>
+          <w:tcPr/>
+          <w:p>
+            <w:pPr>
+              <w:pStyle w:val="Compact"/>
+              <w:jc w:val="right"/>
+            </w:pPr>
+            <w:r>
+              <w:t xml:space="preserve">2.85</w:t>
+            </w:r>
+          </w:p>
+        </w:tc>
+        <w:tc>
+          <w:tcPr/>
+          <w:p>
+            <w:pPr>
+              <w:pStyle w:val="Compact"/>
+              <w:jc w:val="right"/>
+            </w:pPr>
+            <w:r>
+              <w:t xml:space="preserve">2.86%</w:t>
             </w:r>
           </w:p>
         </w:tc>
@@ -8814,7 +8823,7 @@
         <w:rPr>
           <w:rFonts w:hint="eastAsia"/>
         </w:rPr>
-        <w:t xml:space="preserve">22.4%，说明模型并非只复制价格惯性。</w:t>
+        <w:t xml:space="preserve">23.0%，说明模型并非只复制价格惯性。</w:t>
       </w:r>
     </w:p>
     <w:p>
@@ -8863,7 +8872,7 @@
         <w:t xml:space="preserve">为</w:t>
       </w:r>
       <w:r>
-        <w:t xml:space="preserve"> 3.47 </w:t>
+        <w:t xml:space="preserve"> 3.44 </w:t>
       </w:r>
       <w:r>
         <w:rPr>
@@ -8937,7 +8946,7 @@
         <w:rPr>
           <w:rFonts w:hint="eastAsia"/>
         </w:rPr>
-        <w:t xml:space="preserve">3.47；向左平移</w:t>
+        <w:t xml:space="preserve">3.44；向左平移</w:t>
       </w:r>
       <w:r>
         <w:t xml:space="preserve"> 1 </w:t>
@@ -8964,7 +8973,7 @@
         <w:rPr>
           <w:rFonts w:hint="eastAsia"/>
         </w:rPr>
-        <w:t xml:space="preserve">3.95，向左平移</w:t>
+        <w:t xml:space="preserve">3.87，向左平移</w:t>
       </w:r>
       <w:r>
         <w:t xml:space="preserve"> 2 </w:t>
@@ -8982,7 +8991,7 @@
         <w:rPr>
           <w:rFonts w:hint="eastAsia"/>
         </w:rPr>
-        <w:t xml:space="preserve">4.73，说明模型不存在通过整体滞后复制真实曲线获得低误差的现象。</w:t>
+        <w:t xml:space="preserve">4.64，说明模型不存在通过整体滞后复制真实曲线获得低误差的现象。</w:t>
       </w:r>
     </w:p>
     <w:p>
@@ -9078,7 +9087,7 @@
         <w:rPr>
           <w:rFonts w:hint="eastAsia"/>
         </w:rPr>
-        <w:t xml:space="preserve">个交易日与真实价格同向同步变化，1</w:t>
+        <w:t xml:space="preserve">个交易日与真实价格同向同步变化，2</w:t>
       </w:r>
       <w:r>
         <w:t xml:space="preserve"> </w:t>
@@ -9096,16 +9105,7 @@
         <w:rPr>
           <w:rFonts w:hint="eastAsia"/>
         </w:rPr>
-        <w:t xml:space="preserve">日变化，1</w:t>
-      </w:r>
-      <w:r>
-        <w:t xml:space="preserve"> </w:t>
-      </w:r>
-      <w:r>
-        <w:rPr>
-          <w:rFonts w:hint="eastAsia"/>
-        </w:rPr>
-        <w:t xml:space="preserve">个交易日未明显捕捉。该结果说明模型对主要突变方向具有同步解释能力，但对个别日度噪声仍存在不足。</w:t>
+        <w:t xml:space="preserve">日变化。该结果说明模型对主要突变方向具有同步解释能力，但对个别日度噪声仍存在不足。</w:t>
       </w:r>
     </w:p>
     <w:p>
@@ -9837,7 +9837,7 @@
         <w:rPr>
           <w:rFonts w:hint="eastAsia"/>
         </w:rPr>
-        <w:t xml:space="preserve">扰动中，60.5%</w:t>
+        <w:t xml:space="preserve">扰动中，61.0%</w:t>
       </w:r>
       <w:r>
         <w:t xml:space="preserve"> </w:t>
@@ -9864,7 +9864,7 @@
         <w:rPr>
           <w:rFonts w:hint="eastAsia"/>
         </w:rPr>
-        <w:t xml:space="preserve">5，96.9%</w:t>
+        <w:t xml:space="preserve">5，96.6%</w:t>
       </w:r>
       <w:r>
         <w:t xml:space="preserve"> </w:t>
@@ -10755,7 +10755,7 @@
         <w:t xml:space="preserve">为</w:t>
       </w:r>
       <w:r>
-        <w:t xml:space="preserve"> 3.47 </w:t>
+        <w:t xml:space="preserve"> 3.44 </w:t>
       </w:r>
       <w:r>
         <w:rPr>
@@ -10773,7 +10773,7 @@
         <w:t xml:space="preserve">为</w:t>
       </w:r>
       <w:r>
-        <w:t xml:space="preserve"> 2.89 </w:t>
+        <w:t xml:space="preserve"> 2.85 </w:t>
       </w:r>
       <w:r>
         <w:rPr>
@@ -10791,7 +10791,7 @@
         <w:t xml:space="preserve">为</w:t>
       </w:r>
       <w:r>
-        <w:t xml:space="preserve"> 2.84 </w:t>
+        <w:t xml:space="preserve"> 2.81 </w:t>
       </w:r>
       <w:r>
         <w:rPr>
@@ -10809,7 +10809,7 @@
         <w:t xml:space="preserve">为</w:t>
       </w:r>
       <w:r>
-        <w:t xml:space="preserve"> 3.48 </w:t>
+        <w:t xml:space="preserve"> 3.38 </w:t>
       </w:r>
       <w:r>
         <w:rPr>
@@ -10833,7 +10833,7 @@
         <w:rPr>
           <w:rFonts w:hint="eastAsia"/>
         </w:rPr>
-        <w:t xml:space="preserve">22.4%，并在局部参数扰动下保持较窄的优秀价格带。模型质量足以作为后续情景预测的中性基准，也可作为最终论文中短期机制解释部分的核心模型。</w:t>
+        <w:t xml:space="preserve">23.0%，并在局部参数扰动下保持较窄的优秀价格带。模型质量足以作为后续情景预测的中性基准，也可作为最终论文中短期机制解释部分的核心模型。</w:t>
       </w:r>
     </w:p>
     <w:p>

</xml_diff>